<commit_message>
+7lab testing and some fixes
</commit_message>
<xml_diff>
--- a/Software implementation and testing/6/Отчёт №6.docx
+++ b/Software implementation and testing/6/Отчёт №6.docx
@@ -1,6 +1,6 @@
 
 <file path=word/document.xml><?xml version="1.0" encoding="utf-8"?>
-<w:document xmlns:wpc="http://schemas.microsoft.com/office/word/2010/wordprocessingCanvas" xmlns:mc="http://schemas.openxmlformats.org/markup-compatibility/2006" xmlns:o="urn:schemas-microsoft-com:office:office" xmlns:r="http://schemas.openxmlformats.org/officeDocument/2006/relationships" xmlns:m="http://schemas.openxmlformats.org/officeDocument/2006/math" xmlns:v="urn:schemas-microsoft-com:vml" xmlns:wp14="http://schemas.microsoft.com/office/word/2010/wordprocessingDrawing" xmlns:wp="http://schemas.openxmlformats.org/drawingml/2006/wordprocessingDrawing" xmlns:w10="urn:schemas-microsoft-com:office:word" xmlns:w="http://schemas.openxmlformats.org/wordprocessingml/2006/main" xmlns:w14="http://schemas.microsoft.com/office/word/2010/wordml" xmlns:w15="http://schemas.microsoft.com/office/word/2012/wordml" xmlns:wpg="http://schemas.microsoft.com/office/word/2010/wordprocessingGroup" xmlns:wpi="http://schemas.microsoft.com/office/word/2010/wordprocessingInk" xmlns:wne="http://schemas.microsoft.com/office/word/2006/wordml" xmlns:wps="http://schemas.microsoft.com/office/word/2010/wordprocessingShape" mc:Ignorable="w14 w15 wp14">
+<w:document xmlns:wpc="http://schemas.microsoft.com/office/word/2010/wordprocessingCanvas" xmlns:mc="http://schemas.openxmlformats.org/markup-compatibility/2006" xmlns:o="urn:schemas-microsoft-com:office:office" xmlns:r="http://schemas.openxmlformats.org/officeDocument/2006/relationships" xmlns:m="http://schemas.openxmlformats.org/officeDocument/2006/math" xmlns:v="urn:schemas-microsoft-com:vml" xmlns:wp14="http://schemas.microsoft.com/office/word/2010/wordprocessingDrawing" xmlns:wp="http://schemas.openxmlformats.org/drawingml/2006/wordprocessingDrawing" xmlns:w10="urn:schemas-microsoft-com:office:word" xmlns:w="http://schemas.openxmlformats.org/wordprocessingml/2006/main" xmlns:w14="http://schemas.microsoft.com/office/word/2010/wordml" xmlns:wpg="http://schemas.microsoft.com/office/word/2010/wordprocessingGroup" xmlns:wpi="http://schemas.microsoft.com/office/word/2010/wordprocessingInk" xmlns:wne="http://schemas.microsoft.com/office/word/2006/wordml" xmlns:wps="http://schemas.microsoft.com/office/word/2010/wordprocessingShape" mc:Ignorable="w14 wp14">
   <w:body>
     <w:p>
       <w:pPr>
@@ -199,6 +199,8 @@
           <w:szCs w:val="24"/>
         </w:rPr>
       </w:pPr>
+      <w:bookmarkStart w:id="0" w:name="_GoBack"/>
+      <w:bookmarkEnd w:id="0"/>
     </w:p>
     <w:p>
       <w:pPr>
@@ -811,7 +813,7 @@
         </w:rPr>
         <w:t xml:space="preserve"> </w:t>
       </w:r>
-      <w:hyperlink r:id="rId5">
+      <w:hyperlink r:id="rId6">
         <w:r>
           <w:rPr>
             <w:color w:val="1155CC"/>
@@ -820,27 +822,7 @@
             <w:highlight w:val="white"/>
             <w:u w:val="single"/>
           </w:rPr>
-          <w:t>https://apidocs.cheapshar</w:t>
-        </w:r>
-        <w:r>
-          <w:rPr>
-            <w:color w:val="1155CC"/>
-            <w:sz w:val="20"/>
-            <w:szCs w:val="20"/>
-            <w:highlight w:val="white"/>
-            <w:u w:val="single"/>
-          </w:rPr>
-          <w:t>k</w:t>
-        </w:r>
-        <w:r>
-          <w:rPr>
-            <w:color w:val="1155CC"/>
-            <w:sz w:val="20"/>
-            <w:szCs w:val="20"/>
-            <w:highlight w:val="white"/>
-            <w:u w:val="single"/>
-          </w:rPr>
-          <w:t>.com/</w:t>
+          <w:t>https://apidocs.cheapshark.com/</w:t>
         </w:r>
       </w:hyperlink>
       <w:r>
@@ -855,6 +837,9 @@
     <w:p>
       <w:pPr>
         <w:jc w:val="both"/>
+        <w:rPr>
+          <w:lang w:val="ru-RU"/>
+        </w:rPr>
       </w:pPr>
       <w:r>
         <w:t xml:space="preserve">Создаем окружение с переменной </w:t>
@@ -891,7 +876,7 @@
                     <pic:cNvPicPr preferRelativeResize="0"/>
                   </pic:nvPicPr>
                   <pic:blipFill>
-                    <a:blip r:embed="rId6"/>
+                    <a:blip r:embed="rId7"/>
                     <a:srcRect/>
                     <a:stretch>
                       <a:fillRect/>
@@ -950,7 +935,7 @@
                     <pic:cNvPicPr preferRelativeResize="0"/>
                   </pic:nvPicPr>
                   <pic:blipFill>
-                    <a:blip r:embed="rId7"/>
+                    <a:blip r:embed="rId8"/>
                     <a:srcRect/>
                     <a:stretch>
                       <a:fillRect/>
@@ -1009,7 +994,7 @@
                     <pic:cNvPicPr preferRelativeResize="0"/>
                   </pic:nvPicPr>
                   <pic:blipFill>
-                    <a:blip r:embed="rId8"/>
+                    <a:blip r:embed="rId9"/>
                     <a:srcRect/>
                     <a:stretch>
                       <a:fillRect/>
@@ -1073,7 +1058,7 @@
                     <pic:cNvPicPr preferRelativeResize="0"/>
                   </pic:nvPicPr>
                   <pic:blipFill>
-                    <a:blip r:embed="rId9"/>
+                    <a:blip r:embed="rId10"/>
                     <a:srcRect/>
                     <a:stretch>
                       <a:fillRect/>
@@ -1132,7 +1117,7 @@
                     <pic:cNvPicPr preferRelativeResize="0"/>
                   </pic:nvPicPr>
                   <pic:blipFill>
-                    <a:blip r:embed="rId10"/>
+                    <a:blip r:embed="rId11"/>
                     <a:srcRect/>
                     <a:stretch>
                       <a:fillRect/>
@@ -1183,7 +1168,7 @@
                     <pic:cNvPicPr preferRelativeResize="0"/>
                   </pic:nvPicPr>
                   <pic:blipFill>
-                    <a:blip r:embed="rId11"/>
+                    <a:blip r:embed="rId12"/>
                     <a:srcRect/>
                     <a:stretch>
                       <a:fillRect/>
@@ -1246,7 +1231,7 @@
                     <pic:cNvPicPr preferRelativeResize="0"/>
                   </pic:nvPicPr>
                   <pic:blipFill>
-                    <a:blip r:embed="rId12"/>
+                    <a:blip r:embed="rId13"/>
                     <a:srcRect/>
                     <a:stretch>
                       <a:fillRect/>
@@ -1324,7 +1309,7 @@
                     <pic:cNvPicPr preferRelativeResize="0"/>
                   </pic:nvPicPr>
                   <pic:blipFill>
-                    <a:blip r:embed="rId13"/>
+                    <a:blip r:embed="rId14"/>
                     <a:srcRect/>
                     <a:stretch>
                       <a:fillRect/>
@@ -1378,7 +1363,7 @@
                     <pic:cNvPicPr preferRelativeResize="0"/>
                   </pic:nvPicPr>
                   <pic:blipFill>
-                    <a:blip r:embed="rId14"/>
+                    <a:blip r:embed="rId15"/>
                     <a:srcRect/>
                     <a:stretch>
                       <a:fillRect/>
@@ -1437,7 +1422,7 @@
                     <pic:cNvPicPr preferRelativeResize="0"/>
                   </pic:nvPicPr>
                   <pic:blipFill>
-                    <a:blip r:embed="rId15"/>
+                    <a:blip r:embed="rId16"/>
                     <a:srcRect/>
                     <a:stretch>
                       <a:fillRect/>
@@ -1469,7 +1454,6 @@
       <w:pPr>
         <w:jc w:val="both"/>
       </w:pPr>
-      <w:bookmarkStart w:id="0" w:name="_GoBack"/>
       <w:r>
         <w:rPr>
           <w:noProof/>
@@ -1490,7 +1474,7 @@
                     <pic:cNvPicPr preferRelativeResize="0"/>
                   </pic:nvPicPr>
                   <pic:blipFill>
-                    <a:blip r:embed="rId16"/>
+                    <a:blip r:embed="rId17"/>
                     <a:srcRect/>
                     <a:stretch>
                       <a:fillRect/>
@@ -1512,7 +1496,6 @@
           </wp:inline>
         </w:drawing>
       </w:r>
-      <w:bookmarkEnd w:id="0"/>
     </w:p>
     <w:p>
       <w:pPr>
@@ -1566,7 +1549,7 @@
                     <pic:cNvPicPr preferRelativeResize="0"/>
                   </pic:nvPicPr>
                   <pic:blipFill>
-                    <a:blip r:embed="rId17"/>
+                    <a:blip r:embed="rId18"/>
                     <a:srcRect/>
                     <a:stretch>
                       <a:fillRect/>
@@ -1628,7 +1611,7 @@
                     <pic:cNvPicPr preferRelativeResize="0"/>
                   </pic:nvPicPr>
                   <pic:blipFill>
-                    <a:blip r:embed="rId18"/>
+                    <a:blip r:embed="rId19"/>
                     <a:srcRect/>
                     <a:stretch>
                       <a:fillRect/>
@@ -1720,7 +1703,7 @@
                     <pic:cNvPicPr preferRelativeResize="0"/>
                   </pic:nvPicPr>
                   <pic:blipFill>
-                    <a:blip r:embed="rId19"/>
+                    <a:blip r:embed="rId20"/>
                     <a:srcRect/>
                     <a:stretch>
                       <a:fillRect/>
@@ -1766,7 +1749,7 @@
                     <pic:cNvPicPr preferRelativeResize="0"/>
                   </pic:nvPicPr>
                   <pic:blipFill>
-                    <a:blip r:embed="rId20"/>
+                    <a:blip r:embed="rId21"/>
                     <a:srcRect/>
                     <a:stretch>
                       <a:fillRect/>
@@ -1799,6 +1782,7 @@
     </w:p>
     <w:p>
       <w:pPr>
+        <w:jc w:val="both"/>
         <w:rPr>
           <w:rFonts w:ascii="Times New Roman" w:eastAsia="Times New Roman" w:hAnsi="Times New Roman" w:cs="Times New Roman"/>
           <w:sz w:val="24"/>
@@ -1823,9 +1807,8 @@
           <w:szCs w:val="24"/>
           <w:lang w:val="ru-RU"/>
         </w:rPr>
-        <w:t xml:space="preserve">Сайт с </w:t>
-      </w:r>
-      <w:proofErr w:type="spellStart"/>
+        <w:t>Дополнительный пример: н</w:t>
+      </w:r>
       <w:r>
         <w:rPr>
           <w:rFonts w:ascii="Times New Roman" w:eastAsia="Times New Roman" w:hAnsi="Times New Roman" w:cs="Times New Roman"/>
@@ -1833,9 +1816,8 @@
           <w:szCs w:val="24"/>
           <w:lang w:val="ru-RU"/>
         </w:rPr>
-        <w:t>апи</w:t>
-      </w:r>
-      <w:proofErr w:type="spellEnd"/>
+        <w:t>аписанный скрипт для тестирования получаемых данных</w:t>
+      </w:r>
       <w:r>
         <w:rPr>
           <w:rFonts w:ascii="Times New Roman" w:eastAsia="Times New Roman" w:hAnsi="Times New Roman" w:cs="Times New Roman"/>
@@ -1843,125 +1825,25 @@
           <w:szCs w:val="24"/>
           <w:lang w:val="ru-RU"/>
         </w:rPr>
-        <w:t xml:space="preserve"> </w:t>
-      </w:r>
-      <w:proofErr w:type="spellStart"/>
-      <w:r>
-        <w:rPr>
-          <w:rFonts w:ascii="Times New Roman" w:eastAsia="Times New Roman" w:hAnsi="Times New Roman" w:cs="Times New Roman"/>
+        <w:t>:</w:t>
+      </w:r>
+    </w:p>
+    <w:p>
+      <w:pPr>
+        <w:rPr>
+          <w:rFonts w:ascii="Times New Roman" w:eastAsia="Times New Roman" w:hAnsi="Times New Roman" w:cs="Times New Roman"/>
+          <w:sz w:val="24"/>
+          <w:szCs w:val="24"/>
+          <w:lang w:val="en-US"/>
+        </w:rPr>
+      </w:pPr>
+      <w:r>
+        <w:rPr>
+          <w:rFonts w:ascii="Times New Roman" w:eastAsia="Times New Roman" w:hAnsi="Times New Roman" w:cs="Times New Roman"/>
+          <w:noProof/>
           <w:sz w:val="24"/>
           <w:szCs w:val="24"/>
           <w:lang w:val="ru-RU"/>
-        </w:rPr>
-        <w:t>авиасейлс</w:t>
-      </w:r>
-      <w:proofErr w:type="spellEnd"/>
-      <w:r>
-        <w:rPr>
-          <w:rFonts w:ascii="Times New Roman" w:eastAsia="Times New Roman" w:hAnsi="Times New Roman" w:cs="Times New Roman"/>
-          <w:sz w:val="24"/>
-          <w:szCs w:val="24"/>
-          <w:lang w:val="ru-RU"/>
-        </w:rPr>
-        <w:t xml:space="preserve"> не работает</w:t>
-      </w:r>
-    </w:p>
-    <w:p>
-      <w:pPr>
-        <w:rPr>
-          <w:rFonts w:ascii="Times New Roman" w:eastAsia="Times New Roman" w:hAnsi="Times New Roman" w:cs="Times New Roman"/>
-          <w:sz w:val="24"/>
-          <w:szCs w:val="24"/>
-          <w:lang w:val="ru-RU"/>
-        </w:rPr>
-      </w:pPr>
-      <w:r>
-        <w:rPr>
-          <w:rFonts w:ascii="Times New Roman" w:eastAsia="Times New Roman" w:hAnsi="Times New Roman" w:cs="Times New Roman"/>
-          <w:sz w:val="24"/>
-          <w:szCs w:val="24"/>
-          <w:lang w:val="ru-RU"/>
-        </w:rPr>
-        <w:drawing>
-          <wp:inline distT="0" distB="0" distL="0" distR="0" wp14:anchorId="4F88ACB2" wp14:editId="70910CF2">
-            <wp:extent cx="5733415" cy="2026920"/>
-            <wp:effectExtent l="0" t="0" r="635" b="0"/>
-            <wp:docPr id="16" name="Рисунок 16"/>
-            <wp:cNvGraphicFramePr>
-              <a:graphicFrameLocks xmlns:a="http://schemas.openxmlformats.org/drawingml/2006/main" noChangeAspect="1"/>
-            </wp:cNvGraphicFramePr>
-            <a:graphic xmlns:a="http://schemas.openxmlformats.org/drawingml/2006/main">
-              <a:graphicData uri="http://schemas.openxmlformats.org/drawingml/2006/picture">
-                <pic:pic xmlns:pic="http://schemas.openxmlformats.org/drawingml/2006/picture">
-                  <pic:nvPicPr>
-                    <pic:cNvPr id="1" name=""/>
-                    <pic:cNvPicPr/>
-                  </pic:nvPicPr>
-                  <pic:blipFill>
-                    <a:blip r:embed="rId21"/>
-                    <a:stretch>
-                      <a:fillRect/>
-                    </a:stretch>
-                  </pic:blipFill>
-                  <pic:spPr>
-                    <a:xfrm>
-                      <a:off x="0" y="0"/>
-                      <a:ext cx="5733415" cy="2026920"/>
-                    </a:xfrm>
-                    <a:prstGeom prst="rect">
-                      <a:avLst/>
-                    </a:prstGeom>
-                  </pic:spPr>
-                </pic:pic>
-              </a:graphicData>
-            </a:graphic>
-          </wp:inline>
-        </w:drawing>
-      </w:r>
-    </w:p>
-    <w:p>
-      <w:pPr>
-        <w:rPr>
-          <w:rFonts w:ascii="Times New Roman" w:eastAsia="Times New Roman" w:hAnsi="Times New Roman" w:cs="Times New Roman"/>
-          <w:sz w:val="24"/>
-          <w:szCs w:val="24"/>
-          <w:lang w:val="ru-RU"/>
-        </w:rPr>
-      </w:pPr>
-      <w:r>
-        <w:rPr>
-          <w:rFonts w:ascii="Times New Roman" w:eastAsia="Times New Roman" w:hAnsi="Times New Roman" w:cs="Times New Roman"/>
-          <w:sz w:val="24"/>
-          <w:szCs w:val="24"/>
-          <w:lang w:val="ru-RU"/>
-        </w:rPr>
-        <w:t>Написанный скрипт для тестирования получаемых данных</w:t>
-      </w:r>
-      <w:r>
-        <w:rPr>
-          <w:rFonts w:ascii="Times New Roman" w:eastAsia="Times New Roman" w:hAnsi="Times New Roman" w:cs="Times New Roman"/>
-          <w:sz w:val="24"/>
-          <w:szCs w:val="24"/>
-          <w:lang w:val="ru-RU"/>
-        </w:rPr>
-        <w:t>:</w:t>
-      </w:r>
-    </w:p>
-    <w:p>
-      <w:pPr>
-        <w:rPr>
-          <w:rFonts w:ascii="Times New Roman" w:eastAsia="Times New Roman" w:hAnsi="Times New Roman" w:cs="Times New Roman"/>
-          <w:sz w:val="24"/>
-          <w:szCs w:val="24"/>
-          <w:lang w:val="en-US"/>
-        </w:rPr>
-      </w:pPr>
-      <w:r>
-        <w:rPr>
-          <w:rFonts w:ascii="Times New Roman" w:eastAsia="Times New Roman" w:hAnsi="Times New Roman" w:cs="Times New Roman"/>
-          <w:sz w:val="24"/>
-          <w:szCs w:val="24"/>
-          <w:lang w:val="en-US"/>
         </w:rPr>
         <w:drawing>
           <wp:inline distT="0" distB="0" distL="0" distR="0" wp14:anchorId="26D7C8FE" wp14:editId="226E3128">
@@ -2052,12 +1934,13 @@
           <w:rFonts w:ascii="Times New Roman" w:eastAsia="Times New Roman" w:hAnsi="Times New Roman" w:cs="Times New Roman"/>
           <w:sz w:val="24"/>
           <w:szCs w:val="24"/>
-          <w:lang w:val="ru-RU"/>
-        </w:rPr>
-      </w:pPr>
-      <w:r>
-        <w:rPr>
-          <w:rFonts w:ascii="Times New Roman" w:eastAsia="Times New Roman" w:hAnsi="Times New Roman" w:cs="Times New Roman"/>
+          <w:lang w:val="en-US"/>
+        </w:rPr>
+      </w:pPr>
+      <w:r>
+        <w:rPr>
+          <w:rFonts w:ascii="Times New Roman" w:eastAsia="Times New Roman" w:hAnsi="Times New Roman" w:cs="Times New Roman"/>
+          <w:noProof/>
           <w:sz w:val="24"/>
           <w:szCs w:val="24"/>
           <w:lang w:val="ru-RU"/>
@@ -2099,6 +1982,87 @@
           </wp:inline>
         </w:drawing>
       </w:r>
+      <w:r>
+        <w:rPr>
+          <w:rFonts w:ascii="Times New Roman" w:eastAsia="Times New Roman" w:hAnsi="Times New Roman" w:cs="Times New Roman"/>
+          <w:sz w:val="24"/>
+          <w:szCs w:val="24"/>
+          <w:lang w:val="ru-RU"/>
+        </w:rPr>
+        <w:t>файл</w:t>
+      </w:r>
+      <w:r>
+        <w:rPr>
+          <w:rFonts w:ascii="Times New Roman" w:eastAsia="Times New Roman" w:hAnsi="Times New Roman" w:cs="Times New Roman"/>
+          <w:sz w:val="24"/>
+          <w:szCs w:val="24"/>
+          <w:lang w:val="en-US"/>
+        </w:rPr>
+        <w:t>.csv:</w:t>
+      </w:r>
+      <w:r>
+        <w:rPr>
+          <w:rFonts w:ascii="Times New Roman" w:eastAsia="Times New Roman" w:hAnsi="Times New Roman" w:cs="Times New Roman"/>
+          <w:sz w:val="24"/>
+          <w:szCs w:val="24"/>
+          <w:lang w:val="en-US"/>
+        </w:rPr>
+        <w:br/>
+      </w:r>
+      <w:r>
+        <w:rPr>
+          <w:rFonts w:ascii="Times New Roman" w:eastAsia="Times New Roman" w:hAnsi="Times New Roman" w:cs="Times New Roman"/>
+          <w:noProof/>
+          <w:sz w:val="24"/>
+          <w:szCs w:val="24"/>
+          <w:lang w:val="ru-RU"/>
+        </w:rPr>
+        <w:drawing>
+          <wp:inline distT="0" distB="0" distL="0" distR="0" wp14:anchorId="0043A07E" wp14:editId="3D70B3AD">
+            <wp:extent cx="1286055" cy="1066949"/>
+            <wp:effectExtent l="0" t="0" r="9525" b="0"/>
+            <wp:docPr id="19" name="Рисунок 19"/>
+            <wp:cNvGraphicFramePr>
+              <a:graphicFrameLocks xmlns:a="http://schemas.openxmlformats.org/drawingml/2006/main" noChangeAspect="1"/>
+            </wp:cNvGraphicFramePr>
+            <a:graphic xmlns:a="http://schemas.openxmlformats.org/drawingml/2006/main">
+              <a:graphicData uri="http://schemas.openxmlformats.org/drawingml/2006/picture">
+                <pic:pic xmlns:pic="http://schemas.openxmlformats.org/drawingml/2006/picture">
+                  <pic:nvPicPr>
+                    <pic:cNvPr id="0" name=""/>
+                    <pic:cNvPicPr/>
+                  </pic:nvPicPr>
+                  <pic:blipFill>
+                    <a:blip r:embed="rId24"/>
+                    <a:stretch>
+                      <a:fillRect/>
+                    </a:stretch>
+                  </pic:blipFill>
+                  <pic:spPr>
+                    <a:xfrm>
+                      <a:off x="0" y="0"/>
+                      <a:ext cx="1286055" cy="1066949"/>
+                    </a:xfrm>
+                    <a:prstGeom prst="rect">
+                      <a:avLst/>
+                    </a:prstGeom>
+                  </pic:spPr>
+                </pic:pic>
+              </a:graphicData>
+            </a:graphic>
+          </wp:inline>
+        </w:drawing>
+      </w:r>
+    </w:p>
+    <w:p>
+      <w:pPr>
+        <w:rPr>
+          <w:rFonts w:ascii="Times New Roman" w:eastAsia="Times New Roman" w:hAnsi="Times New Roman" w:cs="Times New Roman"/>
+          <w:sz w:val="24"/>
+          <w:szCs w:val="24"/>
+          <w:lang w:val="en-US"/>
+        </w:rPr>
+      </w:pPr>
     </w:p>
     <w:sectPr>
       <w:pgSz w:w="11909" w:h="16834"/>
@@ -2111,8 +2075,8 @@
 </file>
 
 <file path=word/numbering.xml><?xml version="1.0" encoding="utf-8"?>
-<w:numbering xmlns:wpc="http://schemas.microsoft.com/office/word/2010/wordprocessingCanvas" xmlns:mc="http://schemas.openxmlformats.org/markup-compatibility/2006" xmlns:o="urn:schemas-microsoft-com:office:office" xmlns:r="http://schemas.openxmlformats.org/officeDocument/2006/relationships" xmlns:m="http://schemas.openxmlformats.org/officeDocument/2006/math" xmlns:v="urn:schemas-microsoft-com:vml" xmlns:wp14="http://schemas.microsoft.com/office/word/2010/wordprocessingDrawing" xmlns:wp="http://schemas.openxmlformats.org/drawingml/2006/wordprocessingDrawing" xmlns:w10="urn:schemas-microsoft-com:office:word" xmlns:w="http://schemas.openxmlformats.org/wordprocessingml/2006/main" xmlns:w14="http://schemas.microsoft.com/office/word/2010/wordml" xmlns:w15="http://schemas.microsoft.com/office/word/2012/wordml" xmlns:wpg="http://schemas.microsoft.com/office/word/2010/wordprocessingGroup" xmlns:wpi="http://schemas.microsoft.com/office/word/2010/wordprocessingInk" xmlns:wne="http://schemas.microsoft.com/office/word/2006/wordml" xmlns:wps="http://schemas.microsoft.com/office/word/2010/wordprocessingShape" mc:Ignorable="w14 w15 wp14">
-  <w:abstractNum w:abstractNumId="0" w15:restartNumberingAfterBreak="0">
+<w:numbering xmlns:wpc="http://schemas.microsoft.com/office/word/2010/wordprocessingCanvas" xmlns:mc="http://schemas.openxmlformats.org/markup-compatibility/2006" xmlns:o="urn:schemas-microsoft-com:office:office" xmlns:r="http://schemas.openxmlformats.org/officeDocument/2006/relationships" xmlns:m="http://schemas.openxmlformats.org/officeDocument/2006/math" xmlns:v="urn:schemas-microsoft-com:vml" xmlns:wp14="http://schemas.microsoft.com/office/word/2010/wordprocessingDrawing" xmlns:wp="http://schemas.openxmlformats.org/drawingml/2006/wordprocessingDrawing" xmlns:w10="urn:schemas-microsoft-com:office:word" xmlns:w="http://schemas.openxmlformats.org/wordprocessingml/2006/main" xmlns:w14="http://schemas.microsoft.com/office/word/2010/wordml" xmlns:wpg="http://schemas.microsoft.com/office/word/2010/wordprocessingGroup" xmlns:wpi="http://schemas.microsoft.com/office/word/2010/wordprocessingInk" xmlns:wne="http://schemas.microsoft.com/office/word/2006/wordml" xmlns:wps="http://schemas.microsoft.com/office/word/2010/wordprocessingShape" mc:Ignorable="w14 wp14">
+  <w:abstractNum w:abstractNumId="0">
     <w:nsid w:val="0A0649BE"/>
     <w:multiLevelType w:val="hybridMultilevel"/>
     <w:tmpl w:val="8E0E2BF2"/>
@@ -2198,7 +2162,7 @@
       </w:pPr>
     </w:lvl>
   </w:abstractNum>
-  <w:abstractNum w:abstractNumId="1" w15:restartNumberingAfterBreak="0">
+  <w:abstractNum w:abstractNumId="1">
     <w:nsid w:val="1B3039CC"/>
     <w:multiLevelType w:val="hybridMultilevel"/>
     <w:tmpl w:val="FB02FF4C"/>
@@ -2284,7 +2248,7 @@
       </w:pPr>
     </w:lvl>
   </w:abstractNum>
-  <w:abstractNum w:abstractNumId="2" w15:restartNumberingAfterBreak="0">
+  <w:abstractNum w:abstractNumId="2">
     <w:nsid w:val="22AA08D8"/>
     <w:multiLevelType w:val="hybridMultilevel"/>
     <w:tmpl w:val="ED86D8A2"/>
@@ -2370,7 +2334,7 @@
       </w:pPr>
     </w:lvl>
   </w:abstractNum>
-  <w:abstractNum w:abstractNumId="3" w15:restartNumberingAfterBreak="0">
+  <w:abstractNum w:abstractNumId="3">
     <w:nsid w:val="33120878"/>
     <w:multiLevelType w:val="hybridMultilevel"/>
     <w:tmpl w:val="001A4A18"/>
@@ -2475,7 +2439,7 @@
 </file>
 
 <file path=word/styles.xml><?xml version="1.0" encoding="utf-8"?>
-<w:styles xmlns:mc="http://schemas.openxmlformats.org/markup-compatibility/2006" xmlns:r="http://schemas.openxmlformats.org/officeDocument/2006/relationships" xmlns:w="http://schemas.openxmlformats.org/wordprocessingml/2006/main" xmlns:w14="http://schemas.microsoft.com/office/word/2010/wordml" xmlns:w15="http://schemas.microsoft.com/office/word/2012/wordml" mc:Ignorable="w14 w15">
+<w:styles xmlns:mc="http://schemas.openxmlformats.org/markup-compatibility/2006" xmlns:r="http://schemas.openxmlformats.org/officeDocument/2006/relationships" xmlns:w="http://schemas.openxmlformats.org/wordprocessingml/2006/main" xmlns:w14="http://schemas.microsoft.com/office/word/2010/wordml" mc:Ignorable="w14">
   <w:docDefaults>
     <w:rPrDefault>
       <w:rPr>
@@ -2491,378 +2455,505 @@
       </w:pPr>
     </w:pPrDefault>
   </w:docDefaults>
-  <w:latentStyles w:defLockedState="0" w:defUIPriority="99" w:defSemiHidden="0" w:defUnhideWhenUsed="0" w:defQFormat="0" w:count="371">
-    <w:lsdException w:name="Normal" w:uiPriority="0" w:qFormat="1"/>
-    <w:lsdException w:name="heading 1" w:uiPriority="9" w:qFormat="1"/>
-    <w:lsdException w:name="heading 2" w:semiHidden="1" w:uiPriority="9" w:unhideWhenUsed="1" w:qFormat="1"/>
-    <w:lsdException w:name="heading 3" w:semiHidden="1" w:uiPriority="9" w:unhideWhenUsed="1" w:qFormat="1"/>
-    <w:lsdException w:name="heading 4" w:semiHidden="1" w:uiPriority="9" w:unhideWhenUsed="1" w:qFormat="1"/>
-    <w:lsdException w:name="heading 5" w:semiHidden="1" w:uiPriority="9" w:unhideWhenUsed="1" w:qFormat="1"/>
-    <w:lsdException w:name="heading 6" w:semiHidden="1" w:uiPriority="9" w:unhideWhenUsed="1" w:qFormat="1"/>
-    <w:lsdException w:name="heading 7" w:semiHidden="1" w:uiPriority="9" w:unhideWhenUsed="1" w:qFormat="1"/>
-    <w:lsdException w:name="heading 8" w:semiHidden="1" w:uiPriority="9" w:unhideWhenUsed="1" w:qFormat="1"/>
-    <w:lsdException w:name="heading 9" w:semiHidden="1" w:uiPriority="9" w:unhideWhenUsed="1" w:qFormat="1"/>
-    <w:lsdException w:name="index 1" w:semiHidden="1" w:unhideWhenUsed="1"/>
-    <w:lsdException w:name="index 2" w:semiHidden="1" w:unhideWhenUsed="1"/>
-    <w:lsdException w:name="index 3" w:semiHidden="1" w:unhideWhenUsed="1"/>
-    <w:lsdException w:name="index 4" w:semiHidden="1" w:unhideWhenUsed="1"/>
-    <w:lsdException w:name="index 5" w:semiHidden="1" w:unhideWhenUsed="1"/>
-    <w:lsdException w:name="index 6" w:semiHidden="1" w:unhideWhenUsed="1"/>
-    <w:lsdException w:name="index 7" w:semiHidden="1" w:unhideWhenUsed="1"/>
-    <w:lsdException w:name="index 8" w:semiHidden="1" w:unhideWhenUsed="1"/>
-    <w:lsdException w:name="index 9" w:semiHidden="1" w:unhideWhenUsed="1"/>
-    <w:lsdException w:name="toc 1" w:semiHidden="1" w:uiPriority="39" w:unhideWhenUsed="1"/>
-    <w:lsdException w:name="toc 2" w:semiHidden="1" w:uiPriority="39" w:unhideWhenUsed="1"/>
-    <w:lsdException w:name="toc 3" w:semiHidden="1" w:uiPriority="39" w:unhideWhenUsed="1"/>
-    <w:lsdException w:name="toc 4" w:semiHidden="1" w:uiPriority="39" w:unhideWhenUsed="1"/>
-    <w:lsdException w:name="toc 5" w:semiHidden="1" w:uiPriority="39" w:unhideWhenUsed="1"/>
-    <w:lsdException w:name="toc 6" w:semiHidden="1" w:uiPriority="39" w:unhideWhenUsed="1"/>
-    <w:lsdException w:name="toc 7" w:semiHidden="1" w:uiPriority="39" w:unhideWhenUsed="1"/>
-    <w:lsdException w:name="toc 8" w:semiHidden="1" w:uiPriority="39" w:unhideWhenUsed="1"/>
-    <w:lsdException w:name="toc 9" w:semiHidden="1" w:uiPriority="39" w:unhideWhenUsed="1"/>
-    <w:lsdException w:name="Normal Indent" w:semiHidden="1" w:unhideWhenUsed="1"/>
-    <w:lsdException w:name="footnote text" w:semiHidden="1" w:unhideWhenUsed="1"/>
-    <w:lsdException w:name="annotation text" w:semiHidden="1" w:unhideWhenUsed="1"/>
-    <w:lsdException w:name="header" w:semiHidden="1" w:unhideWhenUsed="1"/>
-    <w:lsdException w:name="footer" w:semiHidden="1" w:unhideWhenUsed="1"/>
-    <w:lsdException w:name="index heading" w:semiHidden="1" w:unhideWhenUsed="1"/>
-    <w:lsdException w:name="caption" w:semiHidden="1" w:uiPriority="35" w:unhideWhenUsed="1" w:qFormat="1"/>
-    <w:lsdException w:name="table of figures" w:semiHidden="1" w:unhideWhenUsed="1"/>
-    <w:lsdException w:name="envelope address" w:semiHidden="1" w:unhideWhenUsed="1"/>
-    <w:lsdException w:name="envelope return" w:semiHidden="1" w:unhideWhenUsed="1"/>
-    <w:lsdException w:name="footnote reference" w:semiHidden="1" w:unhideWhenUsed="1"/>
-    <w:lsdException w:name="annotation reference" w:semiHidden="1" w:unhideWhenUsed="1"/>
-    <w:lsdException w:name="line number" w:semiHidden="1" w:unhideWhenUsed="1"/>
-    <w:lsdException w:name="page number" w:semiHidden="1" w:unhideWhenUsed="1"/>
-    <w:lsdException w:name="endnote reference" w:semiHidden="1" w:unhideWhenUsed="1"/>
-    <w:lsdException w:name="endnote text" w:semiHidden="1" w:unhideWhenUsed="1"/>
-    <w:lsdException w:name="table of authorities" w:semiHidden="1" w:unhideWhenUsed="1"/>
-    <w:lsdException w:name="macro" w:semiHidden="1" w:unhideWhenUsed="1"/>
-    <w:lsdException w:name="toa heading" w:semiHidden="1" w:unhideWhenUsed="1"/>
-    <w:lsdException w:name="List" w:semiHidden="1" w:unhideWhenUsed="1"/>
-    <w:lsdException w:name="List Bullet" w:semiHidden="1" w:unhideWhenUsed="1"/>
-    <w:lsdException w:name="List Number" w:semiHidden="1" w:unhideWhenUsed="1"/>
-    <w:lsdException w:name="List 2" w:semiHidden="1" w:unhideWhenUsed="1"/>
-    <w:lsdException w:name="List 3" w:semiHidden="1" w:unhideWhenUsed="1"/>
-    <w:lsdException w:name="List 4" w:semiHidden="1" w:unhideWhenUsed="1"/>
-    <w:lsdException w:name="List 5" w:semiHidden="1" w:unhideWhenUsed="1"/>
-    <w:lsdException w:name="List Bullet 2" w:semiHidden="1" w:unhideWhenUsed="1"/>
-    <w:lsdException w:name="List Bullet 3" w:semiHidden="1" w:unhideWhenUsed="1"/>
-    <w:lsdException w:name="List Bullet 4" w:semiHidden="1" w:unhideWhenUsed="1"/>
-    <w:lsdException w:name="List Bullet 5" w:semiHidden="1" w:unhideWhenUsed="1"/>
-    <w:lsdException w:name="List Number 2" w:semiHidden="1" w:unhideWhenUsed="1"/>
-    <w:lsdException w:name="List Number 3" w:semiHidden="1" w:unhideWhenUsed="1"/>
-    <w:lsdException w:name="List Number 4" w:semiHidden="1" w:unhideWhenUsed="1"/>
-    <w:lsdException w:name="List Number 5" w:semiHidden="1" w:unhideWhenUsed="1"/>
-    <w:lsdException w:name="Title" w:uiPriority="10" w:qFormat="1"/>
-    <w:lsdException w:name="Closing" w:semiHidden="1" w:unhideWhenUsed="1"/>
-    <w:lsdException w:name="Signature" w:semiHidden="1" w:unhideWhenUsed="1"/>
-    <w:lsdException w:name="Default Paragraph Font" w:semiHidden="1" w:uiPriority="1" w:unhideWhenUsed="1"/>
-    <w:lsdException w:name="Body Text" w:semiHidden="1" w:unhideWhenUsed="1"/>
-    <w:lsdException w:name="Body Text Indent" w:semiHidden="1" w:unhideWhenUsed="1"/>
-    <w:lsdException w:name="List Continue" w:semiHidden="1" w:unhideWhenUsed="1"/>
-    <w:lsdException w:name="List Continue 2" w:semiHidden="1" w:unhideWhenUsed="1"/>
-    <w:lsdException w:name="List Continue 3" w:semiHidden="1" w:unhideWhenUsed="1"/>
-    <w:lsdException w:name="List Continue 4" w:semiHidden="1" w:unhideWhenUsed="1"/>
-    <w:lsdException w:name="List Continue 5" w:semiHidden="1" w:unhideWhenUsed="1"/>
-    <w:lsdException w:name="Message Header" w:semiHidden="1" w:unhideWhenUsed="1"/>
-    <w:lsdException w:name="Subtitle" w:uiPriority="11" w:qFormat="1"/>
-    <w:lsdException w:name="Salutation" w:semiHidden="1" w:unhideWhenUsed="1"/>
-    <w:lsdException w:name="Date" w:semiHidden="1" w:unhideWhenUsed="1"/>
-    <w:lsdException w:name="Body Text First Indent" w:semiHidden="1" w:unhideWhenUsed="1"/>
-    <w:lsdException w:name="Body Text First Indent 2" w:semiHidden="1" w:unhideWhenUsed="1"/>
-    <w:lsdException w:name="Note Heading" w:semiHidden="1" w:unhideWhenUsed="1"/>
-    <w:lsdException w:name="Body Text 2" w:semiHidden="1" w:unhideWhenUsed="1"/>
-    <w:lsdException w:name="Body Text 3" w:semiHidden="1" w:unhideWhenUsed="1"/>
-    <w:lsdException w:name="Body Text Indent 2" w:semiHidden="1" w:unhideWhenUsed="1"/>
-    <w:lsdException w:name="Body Text Indent 3" w:semiHidden="1" w:unhideWhenUsed="1"/>
-    <w:lsdException w:name="Block Text" w:semiHidden="1" w:unhideWhenUsed="1"/>
-    <w:lsdException w:name="Hyperlink" w:semiHidden="1" w:unhideWhenUsed="1"/>
-    <w:lsdException w:name="FollowedHyperlink" w:semiHidden="1" w:unhideWhenUsed="1"/>
-    <w:lsdException w:name="Strong" w:uiPriority="22" w:qFormat="1"/>
-    <w:lsdException w:name="Emphasis" w:uiPriority="20" w:qFormat="1"/>
-    <w:lsdException w:name="Document Map" w:semiHidden="1" w:unhideWhenUsed="1"/>
-    <w:lsdException w:name="Plain Text" w:semiHidden="1" w:unhideWhenUsed="1"/>
-    <w:lsdException w:name="E-mail Signature" w:semiHidden="1" w:unhideWhenUsed="1"/>
-    <w:lsdException w:name="HTML Top of Form" w:semiHidden="1" w:unhideWhenUsed="1"/>
-    <w:lsdException w:name="HTML Bottom of Form" w:semiHidden="1" w:unhideWhenUsed="1"/>
-    <w:lsdException w:name="Normal (Web)" w:semiHidden="1" w:unhideWhenUsed="1"/>
-    <w:lsdException w:name="HTML Acronym" w:semiHidden="1" w:unhideWhenUsed="1"/>
-    <w:lsdException w:name="HTML Address" w:semiHidden="1" w:unhideWhenUsed="1"/>
-    <w:lsdException w:name="HTML Cite" w:semiHidden="1" w:unhideWhenUsed="1"/>
-    <w:lsdException w:name="HTML Code" w:semiHidden="1" w:unhideWhenUsed="1"/>
-    <w:lsdException w:name="HTML Definition" w:semiHidden="1" w:unhideWhenUsed="1"/>
-    <w:lsdException w:name="HTML Keyboard" w:semiHidden="1" w:unhideWhenUsed="1"/>
-    <w:lsdException w:name="HTML Preformatted" w:semiHidden="1" w:unhideWhenUsed="1"/>
-    <w:lsdException w:name="HTML Sample" w:semiHidden="1" w:unhideWhenUsed="1"/>
-    <w:lsdException w:name="HTML Typewriter" w:semiHidden="1" w:unhideWhenUsed="1"/>
-    <w:lsdException w:name="HTML Variable" w:semiHidden="1" w:unhideWhenUsed="1"/>
-    <w:lsdException w:name="Normal Table" w:semiHidden="1" w:unhideWhenUsed="1"/>
-    <w:lsdException w:name="annotation subject" w:semiHidden="1" w:unhideWhenUsed="1"/>
-    <w:lsdException w:name="No List" w:semiHidden="1" w:unhideWhenUsed="1"/>
-    <w:lsdException w:name="Outline List 1" w:semiHidden="1" w:unhideWhenUsed="1"/>
-    <w:lsdException w:name="Outline List 2" w:semiHidden="1" w:unhideWhenUsed="1"/>
-    <w:lsdException w:name="Outline List 3" w:semiHidden="1" w:unhideWhenUsed="1"/>
-    <w:lsdException w:name="Table Simple 1" w:semiHidden="1" w:unhideWhenUsed="1"/>
-    <w:lsdException w:name="Table Simple 2" w:semiHidden="1" w:unhideWhenUsed="1"/>
-    <w:lsdException w:name="Table Simple 3" w:semiHidden="1" w:unhideWhenUsed="1"/>
-    <w:lsdException w:name="Table Classic 1" w:semiHidden="1" w:unhideWhenUsed="1"/>
-    <w:lsdException w:name="Table Classic 2" w:semiHidden="1" w:unhideWhenUsed="1"/>
-    <w:lsdException w:name="Table Classic 3" w:semiHidden="1" w:unhideWhenUsed="1"/>
-    <w:lsdException w:name="Table Classic 4" w:semiHidden="1" w:unhideWhenUsed="1"/>
-    <w:lsdException w:name="Table Colorful 1" w:semiHidden="1" w:unhideWhenUsed="1"/>
-    <w:lsdException w:name="Table Colorful 2" w:semiHidden="1" w:unhideWhenUsed="1"/>
-    <w:lsdException w:name="Table Colorful 3" w:semiHidden="1" w:unhideWhenUsed="1"/>
-    <w:lsdException w:name="Table Columns 1" w:semiHidden="1" w:unhideWhenUsed="1"/>
-    <w:lsdException w:name="Table Columns 2" w:semiHidden="1" w:unhideWhenUsed="1"/>
-    <w:lsdException w:name="Table Columns 3" w:semiHidden="1" w:unhideWhenUsed="1"/>
-    <w:lsdException w:name="Table Columns 4" w:semiHidden="1" w:unhideWhenUsed="1"/>
-    <w:lsdException w:name="Table Columns 5" w:semiHidden="1" w:unhideWhenUsed="1"/>
-    <w:lsdException w:name="Table Grid 1" w:semiHidden="1" w:unhideWhenUsed="1"/>
-    <w:lsdException w:name="Table Grid 2" w:semiHidden="1" w:unhideWhenUsed="1"/>
-    <w:lsdException w:name="Table Grid 3" w:semiHidden="1" w:unhideWhenUsed="1"/>
-    <w:lsdException w:name="Table Grid 4" w:semiHidden="1" w:unhideWhenUsed="1"/>
-    <w:lsdException w:name="Table Grid 5" w:semiHidden="1" w:unhideWhenUsed="1"/>
-    <w:lsdException w:name="Table Grid 6" w:semiHidden="1" w:unhideWhenUsed="1"/>
-    <w:lsdException w:name="Table Grid 7" w:semiHidden="1" w:unhideWhenUsed="1"/>
-    <w:lsdException w:name="Table Grid 8" w:semiHidden="1" w:unhideWhenUsed="1"/>
-    <w:lsdException w:name="Table List 1" w:semiHidden="1" w:unhideWhenUsed="1"/>
-    <w:lsdException w:name="Table List 2" w:semiHidden="1" w:unhideWhenUsed="1"/>
-    <w:lsdException w:name="Table List 3" w:semiHidden="1" w:unhideWhenUsed="1"/>
-    <w:lsdException w:name="Table List 4" w:semiHidden="1" w:unhideWhenUsed="1"/>
-    <w:lsdException w:name="Table List 5" w:semiHidden="1" w:unhideWhenUsed="1"/>
-    <w:lsdException w:name="Table List 6" w:semiHidden="1" w:unhideWhenUsed="1"/>
-    <w:lsdException w:name="Table List 7" w:semiHidden="1" w:unhideWhenUsed="1"/>
-    <w:lsdException w:name="Table List 8" w:semiHidden="1" w:unhideWhenUsed="1"/>
-    <w:lsdException w:name="Table 3D effects 1" w:semiHidden="1" w:unhideWhenUsed="1"/>
-    <w:lsdException w:name="Table 3D effects 2" w:semiHidden="1" w:unhideWhenUsed="1"/>
-    <w:lsdException w:name="Table 3D effects 3" w:semiHidden="1" w:unhideWhenUsed="1"/>
-    <w:lsdException w:name="Table Contemporary" w:semiHidden="1" w:unhideWhenUsed="1"/>
-    <w:lsdException w:name="Table Elegant" w:semiHidden="1" w:unhideWhenUsed="1"/>
-    <w:lsdException w:name="Table Professional" w:semiHidden="1" w:unhideWhenUsed="1"/>
-    <w:lsdException w:name="Table Subtle 1" w:semiHidden="1" w:unhideWhenUsed="1"/>
-    <w:lsdException w:name="Table Subtle 2" w:semiHidden="1" w:unhideWhenUsed="1"/>
-    <w:lsdException w:name="Table Web 1" w:semiHidden="1" w:unhideWhenUsed="1"/>
-    <w:lsdException w:name="Table Web 2" w:semiHidden="1" w:unhideWhenUsed="1"/>
-    <w:lsdException w:name="Table Web 3" w:semiHidden="1" w:unhideWhenUsed="1"/>
-    <w:lsdException w:name="Balloon Text" w:semiHidden="1" w:unhideWhenUsed="1"/>
-    <w:lsdException w:name="Table Grid" w:uiPriority="59"/>
-    <w:lsdException w:name="Table Theme" w:semiHidden="1" w:unhideWhenUsed="1"/>
-    <w:lsdException w:name="Placeholder Text" w:semiHidden="1"/>
-    <w:lsdException w:name="No Spacing" w:uiPriority="1" w:qFormat="1"/>
-    <w:lsdException w:name="Light Shading" w:uiPriority="60"/>
-    <w:lsdException w:name="Light List" w:uiPriority="61"/>
-    <w:lsdException w:name="Light Grid" w:uiPriority="62"/>
-    <w:lsdException w:name="Medium Shading 1" w:uiPriority="63"/>
-    <w:lsdException w:name="Medium Shading 2" w:uiPriority="64"/>
-    <w:lsdException w:name="Medium List 1" w:uiPriority="65"/>
-    <w:lsdException w:name="Medium List 2" w:uiPriority="66"/>
-    <w:lsdException w:name="Medium Grid 1" w:uiPriority="67"/>
-    <w:lsdException w:name="Medium Grid 2" w:uiPriority="68"/>
-    <w:lsdException w:name="Medium Grid 3" w:uiPriority="69"/>
-    <w:lsdException w:name="Dark List" w:uiPriority="70"/>
-    <w:lsdException w:name="Colorful Shading" w:uiPriority="71"/>
-    <w:lsdException w:name="Colorful List" w:uiPriority="72"/>
-    <w:lsdException w:name="Colorful Grid" w:uiPriority="73"/>
-    <w:lsdException w:name="Light Shading Accent 1" w:uiPriority="60"/>
-    <w:lsdException w:name="Light List Accent 1" w:uiPriority="61"/>
-    <w:lsdException w:name="Light Grid Accent 1" w:uiPriority="62"/>
-    <w:lsdException w:name="Medium Shading 1 Accent 1" w:uiPriority="63"/>
-    <w:lsdException w:name="Medium Shading 2 Accent 1" w:uiPriority="64"/>
-    <w:lsdException w:name="Medium List 1 Accent 1" w:uiPriority="65"/>
-    <w:lsdException w:name="Revision" w:semiHidden="1"/>
-    <w:lsdException w:name="List Paragraph" w:uiPriority="34" w:qFormat="1"/>
-    <w:lsdException w:name="Quote" w:uiPriority="29" w:qFormat="1"/>
-    <w:lsdException w:name="Intense Quote" w:uiPriority="30" w:qFormat="1"/>
-    <w:lsdException w:name="Medium List 2 Accent 1" w:uiPriority="66"/>
-    <w:lsdException w:name="Medium Grid 1 Accent 1" w:uiPriority="67"/>
-    <w:lsdException w:name="Medium Grid 2 Accent 1" w:uiPriority="68"/>
-    <w:lsdException w:name="Medium Grid 3 Accent 1" w:uiPriority="69"/>
-    <w:lsdException w:name="Dark List Accent 1" w:uiPriority="70"/>
-    <w:lsdException w:name="Colorful Shading Accent 1" w:uiPriority="71"/>
-    <w:lsdException w:name="Colorful List Accent 1" w:uiPriority="72"/>
-    <w:lsdException w:name="Colorful Grid Accent 1" w:uiPriority="73"/>
-    <w:lsdException w:name="Light Shading Accent 2" w:uiPriority="60"/>
-    <w:lsdException w:name="Light List Accent 2" w:uiPriority="61"/>
-    <w:lsdException w:name="Light Grid Accent 2" w:uiPriority="62"/>
-    <w:lsdException w:name="Medium Shading 1 Accent 2" w:uiPriority="63"/>
-    <w:lsdException w:name="Medium Shading 2 Accent 2" w:uiPriority="64"/>
-    <w:lsdException w:name="Medium List 1 Accent 2" w:uiPriority="65"/>
-    <w:lsdException w:name="Medium List 2 Accent 2" w:uiPriority="66"/>
-    <w:lsdException w:name="Medium Grid 1 Accent 2" w:uiPriority="67"/>
-    <w:lsdException w:name="Medium Grid 2 Accent 2" w:uiPriority="68"/>
-    <w:lsdException w:name="Medium Grid 3 Accent 2" w:uiPriority="69"/>
-    <w:lsdException w:name="Dark List Accent 2" w:uiPriority="70"/>
-    <w:lsdException w:name="Colorful Shading Accent 2" w:uiPriority="71"/>
-    <w:lsdException w:name="Colorful List Accent 2" w:uiPriority="72"/>
-    <w:lsdException w:name="Colorful Grid Accent 2" w:uiPriority="73"/>
-    <w:lsdException w:name="Light Shading Accent 3" w:uiPriority="60"/>
-    <w:lsdException w:name="Light List Accent 3" w:uiPriority="61"/>
-    <w:lsdException w:name="Light Grid Accent 3" w:uiPriority="62"/>
-    <w:lsdException w:name="Medium Shading 1 Accent 3" w:uiPriority="63"/>
-    <w:lsdException w:name="Medium Shading 2 Accent 3" w:uiPriority="64"/>
-    <w:lsdException w:name="Medium List 1 Accent 3" w:uiPriority="65"/>
-    <w:lsdException w:name="Medium List 2 Accent 3" w:uiPriority="66"/>
-    <w:lsdException w:name="Medium Grid 1 Accent 3" w:uiPriority="67"/>
-    <w:lsdException w:name="Medium Grid 2 Accent 3" w:uiPriority="68"/>
-    <w:lsdException w:name="Medium Grid 3 Accent 3" w:uiPriority="69"/>
-    <w:lsdException w:name="Dark List Accent 3" w:uiPriority="70"/>
-    <w:lsdException w:name="Colorful Shading Accent 3" w:uiPriority="71"/>
-    <w:lsdException w:name="Colorful List Accent 3" w:uiPriority="72"/>
-    <w:lsdException w:name="Colorful Grid Accent 3" w:uiPriority="73"/>
-    <w:lsdException w:name="Light Shading Accent 4" w:uiPriority="60"/>
-    <w:lsdException w:name="Light List Accent 4" w:uiPriority="61"/>
-    <w:lsdException w:name="Light Grid Accent 4" w:uiPriority="62"/>
-    <w:lsdException w:name="Medium Shading 1 Accent 4" w:uiPriority="63"/>
-    <w:lsdException w:name="Medium Shading 2 Accent 4" w:uiPriority="64"/>
-    <w:lsdException w:name="Medium List 1 Accent 4" w:uiPriority="65"/>
-    <w:lsdException w:name="Medium List 2 Accent 4" w:uiPriority="66"/>
-    <w:lsdException w:name="Medium Grid 1 Accent 4" w:uiPriority="67"/>
-    <w:lsdException w:name="Medium Grid 2 Accent 4" w:uiPriority="68"/>
-    <w:lsdException w:name="Medium Grid 3 Accent 4" w:uiPriority="69"/>
-    <w:lsdException w:name="Dark List Accent 4" w:uiPriority="70"/>
-    <w:lsdException w:name="Colorful Shading Accent 4" w:uiPriority="71"/>
-    <w:lsdException w:name="Colorful List Accent 4" w:uiPriority="72"/>
-    <w:lsdException w:name="Colorful Grid Accent 4" w:uiPriority="73"/>
-    <w:lsdException w:name="Light Shading Accent 5" w:uiPriority="60"/>
-    <w:lsdException w:name="Light List Accent 5" w:uiPriority="61"/>
-    <w:lsdException w:name="Light Grid Accent 5" w:uiPriority="62"/>
-    <w:lsdException w:name="Medium Shading 1 Accent 5" w:uiPriority="63"/>
-    <w:lsdException w:name="Medium Shading 2 Accent 5" w:uiPriority="64"/>
-    <w:lsdException w:name="Medium List 1 Accent 5" w:uiPriority="65"/>
-    <w:lsdException w:name="Medium List 2 Accent 5" w:uiPriority="66"/>
-    <w:lsdException w:name="Medium Grid 1 Accent 5" w:uiPriority="67"/>
-    <w:lsdException w:name="Medium Grid 2 Accent 5" w:uiPriority="68"/>
-    <w:lsdException w:name="Medium Grid 3 Accent 5" w:uiPriority="69"/>
-    <w:lsdException w:name="Dark List Accent 5" w:uiPriority="70"/>
-    <w:lsdException w:name="Colorful Shading Accent 5" w:uiPriority="71"/>
-    <w:lsdException w:name="Colorful List Accent 5" w:uiPriority="72"/>
-    <w:lsdException w:name="Colorful Grid Accent 5" w:uiPriority="73"/>
-    <w:lsdException w:name="Light Shading Accent 6" w:uiPriority="60"/>
-    <w:lsdException w:name="Light List Accent 6" w:uiPriority="61"/>
-    <w:lsdException w:name="Light Grid Accent 6" w:uiPriority="62"/>
-    <w:lsdException w:name="Medium Shading 1 Accent 6" w:uiPriority="63"/>
-    <w:lsdException w:name="Medium Shading 2 Accent 6" w:uiPriority="64"/>
-    <w:lsdException w:name="Medium List 1 Accent 6" w:uiPriority="65"/>
-    <w:lsdException w:name="Medium List 2 Accent 6" w:uiPriority="66"/>
-    <w:lsdException w:name="Medium Grid 1 Accent 6" w:uiPriority="67"/>
-    <w:lsdException w:name="Medium Grid 2 Accent 6" w:uiPriority="68"/>
-    <w:lsdException w:name="Medium Grid 3 Accent 6" w:uiPriority="69"/>
-    <w:lsdException w:name="Dark List Accent 6" w:uiPriority="70"/>
-    <w:lsdException w:name="Colorful Shading Accent 6" w:uiPriority="71"/>
-    <w:lsdException w:name="Colorful List Accent 6" w:uiPriority="72"/>
-    <w:lsdException w:name="Colorful Grid Accent 6" w:uiPriority="73"/>
-    <w:lsdException w:name="Subtle Emphasis" w:uiPriority="19" w:qFormat="1"/>
-    <w:lsdException w:name="Intense Emphasis" w:uiPriority="21" w:qFormat="1"/>
-    <w:lsdException w:name="Subtle Reference" w:uiPriority="31" w:qFormat="1"/>
-    <w:lsdException w:name="Intense Reference" w:uiPriority="32" w:qFormat="1"/>
-    <w:lsdException w:name="Book Title" w:uiPriority="33" w:qFormat="1"/>
-    <w:lsdException w:name="Bibliography" w:semiHidden="1" w:uiPriority="37" w:unhideWhenUsed="1"/>
-    <w:lsdException w:name="TOC Heading" w:semiHidden="1" w:uiPriority="39" w:unhideWhenUsed="1" w:qFormat="1"/>
-    <w:lsdException w:name="Plain Table 1" w:uiPriority="41"/>
-    <w:lsdException w:name="Plain Table 2" w:uiPriority="42"/>
-    <w:lsdException w:name="Plain Table 3" w:uiPriority="43"/>
-    <w:lsdException w:name="Plain Table 4" w:uiPriority="44"/>
-    <w:lsdException w:name="Plain Table 5" w:uiPriority="45"/>
-    <w:lsdException w:name="Grid Table Light" w:uiPriority="40"/>
-    <w:lsdException w:name="Grid Table 1 Light" w:uiPriority="46"/>
-    <w:lsdException w:name="Grid Table 2" w:uiPriority="47"/>
-    <w:lsdException w:name="Grid Table 3" w:uiPriority="48"/>
-    <w:lsdException w:name="Grid Table 4" w:uiPriority="49"/>
-    <w:lsdException w:name="Grid Table 5 Dark" w:uiPriority="50"/>
-    <w:lsdException w:name="Grid Table 6 Colorful" w:uiPriority="51"/>
-    <w:lsdException w:name="Grid Table 7 Colorful" w:uiPriority="52"/>
-    <w:lsdException w:name="Grid Table 1 Light Accent 1" w:uiPriority="46"/>
-    <w:lsdException w:name="Grid Table 2 Accent 1" w:uiPriority="47"/>
-    <w:lsdException w:name="Grid Table 3 Accent 1" w:uiPriority="48"/>
-    <w:lsdException w:name="Grid Table 4 Accent 1" w:uiPriority="49"/>
-    <w:lsdException w:name="Grid Table 5 Dark Accent 1" w:uiPriority="50"/>
-    <w:lsdException w:name="Grid Table 6 Colorful Accent 1" w:uiPriority="51"/>
-    <w:lsdException w:name="Grid Table 7 Colorful Accent 1" w:uiPriority="52"/>
-    <w:lsdException w:name="Grid Table 1 Light Accent 2" w:uiPriority="46"/>
-    <w:lsdException w:name="Grid Table 2 Accent 2" w:uiPriority="47"/>
-    <w:lsdException w:name="Grid Table 3 Accent 2" w:uiPriority="48"/>
-    <w:lsdException w:name="Grid Table 4 Accent 2" w:uiPriority="49"/>
-    <w:lsdException w:name="Grid Table 5 Dark Accent 2" w:uiPriority="50"/>
-    <w:lsdException w:name="Grid Table 6 Colorful Accent 2" w:uiPriority="51"/>
-    <w:lsdException w:name="Grid Table 7 Colorful Accent 2" w:uiPriority="52"/>
-    <w:lsdException w:name="Grid Table 1 Light Accent 3" w:uiPriority="46"/>
-    <w:lsdException w:name="Grid Table 2 Accent 3" w:uiPriority="47"/>
-    <w:lsdException w:name="Grid Table 3 Accent 3" w:uiPriority="48"/>
-    <w:lsdException w:name="Grid Table 4 Accent 3" w:uiPriority="49"/>
-    <w:lsdException w:name="Grid Table 5 Dark Accent 3" w:uiPriority="50"/>
-    <w:lsdException w:name="Grid Table 6 Colorful Accent 3" w:uiPriority="51"/>
-    <w:lsdException w:name="Grid Table 7 Colorful Accent 3" w:uiPriority="52"/>
-    <w:lsdException w:name="Grid Table 1 Light Accent 4" w:uiPriority="46"/>
-    <w:lsdException w:name="Grid Table 2 Accent 4" w:uiPriority="47"/>
-    <w:lsdException w:name="Grid Table 3 Accent 4" w:uiPriority="48"/>
-    <w:lsdException w:name="Grid Table 4 Accent 4" w:uiPriority="49"/>
-    <w:lsdException w:name="Grid Table 5 Dark Accent 4" w:uiPriority="50"/>
-    <w:lsdException w:name="Grid Table 6 Colorful Accent 4" w:uiPriority="51"/>
-    <w:lsdException w:name="Grid Table 7 Colorful Accent 4" w:uiPriority="52"/>
-    <w:lsdException w:name="Grid Table 1 Light Accent 5" w:uiPriority="46"/>
-    <w:lsdException w:name="Grid Table 2 Accent 5" w:uiPriority="47"/>
-    <w:lsdException w:name="Grid Table 3 Accent 5" w:uiPriority="48"/>
-    <w:lsdException w:name="Grid Table 4 Accent 5" w:uiPriority="49"/>
-    <w:lsdException w:name="Grid Table 5 Dark Accent 5" w:uiPriority="50"/>
-    <w:lsdException w:name="Grid Table 6 Colorful Accent 5" w:uiPriority="51"/>
-    <w:lsdException w:name="Grid Table 7 Colorful Accent 5" w:uiPriority="52"/>
-    <w:lsdException w:name="Grid Table 1 Light Accent 6" w:uiPriority="46"/>
-    <w:lsdException w:name="Grid Table 2 Accent 6" w:uiPriority="47"/>
-    <w:lsdException w:name="Grid Table 3 Accent 6" w:uiPriority="48"/>
-    <w:lsdException w:name="Grid Table 4 Accent 6" w:uiPriority="49"/>
-    <w:lsdException w:name="Grid Table 5 Dark Accent 6" w:uiPriority="50"/>
-    <w:lsdException w:name="Grid Table 6 Colorful Accent 6" w:uiPriority="51"/>
-    <w:lsdException w:name="Grid Table 7 Colorful Accent 6" w:uiPriority="52"/>
-    <w:lsdException w:name="List Table 1 Light" w:uiPriority="46"/>
-    <w:lsdException w:name="List Table 2" w:uiPriority="47"/>
-    <w:lsdException w:name="List Table 3" w:uiPriority="48"/>
-    <w:lsdException w:name="List Table 4" w:uiPriority="49"/>
-    <w:lsdException w:name="List Table 5 Dark" w:uiPriority="50"/>
-    <w:lsdException w:name="List Table 6 Colorful" w:uiPriority="51"/>
-    <w:lsdException w:name="List Table 7 Colorful" w:uiPriority="52"/>
-    <w:lsdException w:name="List Table 1 Light Accent 1" w:uiPriority="46"/>
-    <w:lsdException w:name="List Table 2 Accent 1" w:uiPriority="47"/>
-    <w:lsdException w:name="List Table 3 Accent 1" w:uiPriority="48"/>
-    <w:lsdException w:name="List Table 4 Accent 1" w:uiPriority="49"/>
-    <w:lsdException w:name="List Table 5 Dark Accent 1" w:uiPriority="50"/>
-    <w:lsdException w:name="List Table 6 Colorful Accent 1" w:uiPriority="51"/>
-    <w:lsdException w:name="List Table 7 Colorful Accent 1" w:uiPriority="52"/>
-    <w:lsdException w:name="List Table 1 Light Accent 2" w:uiPriority="46"/>
-    <w:lsdException w:name="List Table 2 Accent 2" w:uiPriority="47"/>
-    <w:lsdException w:name="List Table 3 Accent 2" w:uiPriority="48"/>
-    <w:lsdException w:name="List Table 4 Accent 2" w:uiPriority="49"/>
-    <w:lsdException w:name="List Table 5 Dark Accent 2" w:uiPriority="50"/>
-    <w:lsdException w:name="List Table 6 Colorful Accent 2" w:uiPriority="51"/>
-    <w:lsdException w:name="List Table 7 Colorful Accent 2" w:uiPriority="52"/>
-    <w:lsdException w:name="List Table 1 Light Accent 3" w:uiPriority="46"/>
-    <w:lsdException w:name="List Table 2 Accent 3" w:uiPriority="47"/>
-    <w:lsdException w:name="List Table 3 Accent 3" w:uiPriority="48"/>
-    <w:lsdException w:name="List Table 4 Accent 3" w:uiPriority="49"/>
-    <w:lsdException w:name="List Table 5 Dark Accent 3" w:uiPriority="50"/>
-    <w:lsdException w:name="List Table 6 Colorful Accent 3" w:uiPriority="51"/>
-    <w:lsdException w:name="List Table 7 Colorful Accent 3" w:uiPriority="52"/>
-    <w:lsdException w:name="List Table 1 Light Accent 4" w:uiPriority="46"/>
-    <w:lsdException w:name="List Table 2 Accent 4" w:uiPriority="47"/>
-    <w:lsdException w:name="List Table 3 Accent 4" w:uiPriority="48"/>
-    <w:lsdException w:name="List Table 4 Accent 4" w:uiPriority="49"/>
-    <w:lsdException w:name="List Table 5 Dark Accent 4" w:uiPriority="50"/>
-    <w:lsdException w:name="List Table 6 Colorful Accent 4" w:uiPriority="51"/>
-    <w:lsdException w:name="List Table 7 Colorful Accent 4" w:uiPriority="52"/>
-    <w:lsdException w:name="List Table 1 Light Accent 5" w:uiPriority="46"/>
-    <w:lsdException w:name="List Table 2 Accent 5" w:uiPriority="47"/>
-    <w:lsdException w:name="List Table 3 Accent 5" w:uiPriority="48"/>
-    <w:lsdException w:name="List Table 4 Accent 5" w:uiPriority="49"/>
-    <w:lsdException w:name="List Table 5 Dark Accent 5" w:uiPriority="50"/>
-    <w:lsdException w:name="List Table 6 Colorful Accent 5" w:uiPriority="51"/>
-    <w:lsdException w:name="List Table 7 Colorful Accent 5" w:uiPriority="52"/>
-    <w:lsdException w:name="List Table 1 Light Accent 6" w:uiPriority="46"/>
-    <w:lsdException w:name="List Table 2 Accent 6" w:uiPriority="47"/>
-    <w:lsdException w:name="List Table 3 Accent 6" w:uiPriority="48"/>
-    <w:lsdException w:name="List Table 4 Accent 6" w:uiPriority="49"/>
-    <w:lsdException w:name="List Table 5 Dark Accent 6" w:uiPriority="50"/>
-    <w:lsdException w:name="List Table 6 Colorful Accent 6" w:uiPriority="51"/>
-    <w:lsdException w:name="List Table 7 Colorful Accent 6" w:uiPriority="52"/>
+  <w:latentStyles w:defLockedState="0" w:defUIPriority="99" w:defSemiHidden="1" w:defUnhideWhenUsed="1" w:defQFormat="0" w:count="267">
+    <w:lsdException w:name="Normal" w:semiHidden="0" w:uiPriority="0" w:unhideWhenUsed="0" w:qFormat="1"/>
+    <w:lsdException w:name="heading 1" w:semiHidden="0" w:uiPriority="9" w:unhideWhenUsed="0" w:qFormat="1"/>
+    <w:lsdException w:name="heading 2" w:uiPriority="9" w:qFormat="1"/>
+    <w:lsdException w:name="heading 3" w:uiPriority="9" w:qFormat="1"/>
+    <w:lsdException w:name="heading 4" w:uiPriority="9" w:qFormat="1"/>
+    <w:lsdException w:name="heading 5" w:uiPriority="9" w:qFormat="1"/>
+    <w:lsdException w:name="heading 6" w:uiPriority="9" w:qFormat="1"/>
+    <w:lsdException w:name="heading 7" w:uiPriority="9" w:qFormat="1"/>
+    <w:lsdException w:name="heading 8" w:uiPriority="9" w:qFormat="1"/>
+    <w:lsdException w:name="heading 9" w:uiPriority="9" w:qFormat="1"/>
+    <w:lsdException w:name="toc 1" w:uiPriority="39"/>
+    <w:lsdException w:name="toc 2" w:uiPriority="39"/>
+    <w:lsdException w:name="toc 3" w:uiPriority="39"/>
+    <w:lsdException w:name="toc 4" w:uiPriority="39"/>
+    <w:lsdException w:name="toc 5" w:uiPriority="39"/>
+    <w:lsdException w:name="toc 6" w:uiPriority="39"/>
+    <w:lsdException w:name="toc 7" w:uiPriority="39"/>
+    <w:lsdException w:name="toc 8" w:uiPriority="39"/>
+    <w:lsdException w:name="toc 9" w:uiPriority="39"/>
+    <w:lsdException w:name="caption" w:uiPriority="35" w:qFormat="1"/>
+    <w:lsdException w:name="Title" w:semiHidden="0" w:uiPriority="10" w:unhideWhenUsed="0" w:qFormat="1"/>
+    <w:lsdException w:name="Default Paragraph Font" w:uiPriority="1"/>
+    <w:lsdException w:name="Subtitle" w:semiHidden="0" w:uiPriority="11" w:unhideWhenUsed="0" w:qFormat="1"/>
+    <w:lsdException w:name="Strong" w:semiHidden="0" w:uiPriority="22" w:unhideWhenUsed="0" w:qFormat="1"/>
+    <w:lsdException w:name="Emphasis" w:semiHidden="0" w:uiPriority="20" w:unhideWhenUsed="0" w:qFormat="1"/>
+    <w:lsdException w:name="Table Grid" w:semiHidden="0" w:uiPriority="59" w:unhideWhenUsed="0"/>
+    <w:lsdException w:name="Placeholder Text" w:unhideWhenUsed="0"/>
+    <w:lsdException w:name="No Spacing" w:semiHidden="0" w:uiPriority="1" w:unhideWhenUsed="0" w:qFormat="1"/>
+    <w:lsdException w:name="Light Shading" w:semiHidden="0" w:uiPriority="60" w:unhideWhenUsed="0"/>
+    <w:lsdException w:name="Light List" w:semiHidden="0" w:uiPriority="61" w:unhideWhenUsed="0"/>
+    <w:lsdException w:name="Light Grid" w:semiHidden="0" w:uiPriority="62" w:unhideWhenUsed="0"/>
+    <w:lsdException w:name="Medium Shading 1" w:semiHidden="0" w:uiPriority="63" w:unhideWhenUsed="0"/>
+    <w:lsdException w:name="Medium Shading 2" w:semiHidden="0" w:uiPriority="64" w:unhideWhenUsed="0"/>
+    <w:lsdException w:name="Medium List 1" w:semiHidden="0" w:uiPriority="65" w:unhideWhenUsed="0"/>
+    <w:lsdException w:name="Medium List 2" w:semiHidden="0" w:uiPriority="66" w:unhideWhenUsed="0"/>
+    <w:lsdException w:name="Medium Grid 1" w:semiHidden="0" w:uiPriority="67" w:unhideWhenUsed="0"/>
+    <w:lsdException w:name="Medium Grid 2" w:semiHidden="0" w:uiPriority="68" w:unhideWhenUsed="0"/>
+    <w:lsdException w:name="Medium Grid 3" w:semiHidden="0" w:uiPriority="69" w:unhideWhenUsed="0"/>
+    <w:lsdException w:name="Dark List" w:semiHidden="0" w:uiPriority="70" w:unhideWhenUsed="0"/>
+    <w:lsdException w:name="Colorful Shading" w:semiHidden="0" w:uiPriority="71" w:unhideWhenUsed="0"/>
+    <w:lsdException w:name="Colorful List" w:semiHidden="0" w:uiPriority="72" w:unhideWhenUsed="0"/>
+    <w:lsdException w:name="Colorful Grid" w:semiHidden="0" w:uiPriority="73" w:unhideWhenUsed="0"/>
+    <w:lsdException w:name="Light Shading Accent 1" w:semiHidden="0" w:uiPriority="60" w:unhideWhenUsed="0"/>
+    <w:lsdException w:name="Light List Accent 1" w:semiHidden="0" w:uiPriority="61" w:unhideWhenUsed="0"/>
+    <w:lsdException w:name="Light Grid Accent 1" w:semiHidden="0" w:uiPriority="62" w:unhideWhenUsed="0"/>
+    <w:lsdException w:name="Medium Shading 1 Accent 1" w:semiHidden="0" w:uiPriority="63" w:unhideWhenUsed="0"/>
+    <w:lsdException w:name="Medium Shading 2 Accent 1" w:semiHidden="0" w:uiPriority="64" w:unhideWhenUsed="0"/>
+    <w:lsdException w:name="Medium List 1 Accent 1" w:semiHidden="0" w:uiPriority="65" w:unhideWhenUsed="0"/>
+    <w:lsdException w:name="Revision" w:unhideWhenUsed="0"/>
+    <w:lsdException w:name="List Paragraph" w:semiHidden="0" w:uiPriority="34" w:unhideWhenUsed="0" w:qFormat="1"/>
+    <w:lsdException w:name="Quote" w:semiHidden="0" w:uiPriority="29" w:unhideWhenUsed="0" w:qFormat="1"/>
+    <w:lsdException w:name="Intense Quote" w:semiHidden="0" w:uiPriority="30" w:unhideWhenUsed="0" w:qFormat="1"/>
+    <w:lsdException w:name="Medium List 2 Accent 1" w:semiHidden="0" w:uiPriority="66" w:unhideWhenUsed="0"/>
+    <w:lsdException w:name="Medium Grid 1 Accent 1" w:semiHidden="0" w:uiPriority="67" w:unhideWhenUsed="0"/>
+    <w:lsdException w:name="Medium Grid 2 Accent 1" w:semiHidden="0" w:uiPriority="68" w:unhideWhenUsed="0"/>
+    <w:lsdException w:name="Medium Grid 3 Accent 1" w:semiHidden="0" w:uiPriority="69" w:unhideWhenUsed="0"/>
+    <w:lsdException w:name="Dark List Accent 1" w:semiHidden="0" w:uiPriority="70" w:unhideWhenUsed="0"/>
+    <w:lsdException w:name="Colorful Shading Accent 1" w:semiHidden="0" w:uiPriority="71" w:unhideWhenUsed="0"/>
+    <w:lsdException w:name="Colorful List Accent 1" w:semiHidden="0" w:uiPriority="72" w:unhideWhenUsed="0"/>
+    <w:lsdException w:name="Colorful Grid Accent 1" w:semiHidden="0" w:uiPriority="73" w:unhideWhenUsed="0"/>
+    <w:lsdException w:name="Light Shading Accent 2" w:semiHidden="0" w:uiPriority="60" w:unhideWhenUsed="0"/>
+    <w:lsdException w:name="Light List Accent 2" w:semiHidden="0" w:uiPriority="61" w:unhideWhenUsed="0"/>
+    <w:lsdException w:name="Light Grid Accent 2" w:semiHidden="0" w:uiPriority="62" w:unhideWhenUsed="0"/>
+    <w:lsdException w:name="Medium Shading 1 Accent 2" w:semiHidden="0" w:uiPriority="63" w:unhideWhenUsed="0"/>
+    <w:lsdException w:name="Medium Shading 2 Accent 2" w:semiHidden="0" w:uiPriority="64" w:unhideWhenUsed="0"/>
+    <w:lsdException w:name="Medium List 1 Accent 2" w:semiHidden="0" w:uiPriority="65" w:unhideWhenUsed="0"/>
+    <w:lsdException w:name="Medium List 2 Accent 2" w:semiHidden="0" w:uiPriority="66" w:unhideWhenUsed="0"/>
+    <w:lsdException w:name="Medium Grid 1 Accent 2" w:semiHidden="0" w:uiPriority="67" w:unhideWhenUsed="0"/>
+    <w:lsdException w:name="Medium Grid 2 Accent 2" w:semiHidden="0" w:uiPriority="68" w:unhideWhenUsed="0"/>
+    <w:lsdException w:name="Medium Grid 3 Accent 2" w:semiHidden="0" w:uiPriority="69" w:unhideWhenUsed="0"/>
+    <w:lsdException w:name="Dark List Accent 2" w:semiHidden="0" w:uiPriority="70" w:unhideWhenUsed="0"/>
+    <w:lsdException w:name="Colorful Shading Accent 2" w:semiHidden="0" w:uiPriority="71" w:unhideWhenUsed="0"/>
+    <w:lsdException w:name="Colorful List Accent 2" w:semiHidden="0" w:uiPriority="72" w:unhideWhenUsed="0"/>
+    <w:lsdException w:name="Colorful Grid Accent 2" w:semiHidden="0" w:uiPriority="73" w:unhideWhenUsed="0"/>
+    <w:lsdException w:name="Light Shading Accent 3" w:semiHidden="0" w:uiPriority="60" w:unhideWhenUsed="0"/>
+    <w:lsdException w:name="Light List Accent 3" w:semiHidden="0" w:uiPriority="61" w:unhideWhenUsed="0"/>
+    <w:lsdException w:name="Light Grid Accent 3" w:semiHidden="0" w:uiPriority="62" w:unhideWhenUsed="0"/>
+    <w:lsdException w:name="Medium Shading 1 Accent 3" w:semiHidden="0" w:uiPriority="63" w:unhideWhenUsed="0"/>
+    <w:lsdException w:name="Medium Shading 2 Accent 3" w:semiHidden="0" w:uiPriority="64" w:unhideWhenUsed="0"/>
+    <w:lsdException w:name="Medium List 1 Accent 3" w:semiHidden="0" w:uiPriority="65" w:unhideWhenUsed="0"/>
+    <w:lsdException w:name="Medium List 2 Accent 3" w:semiHidden="0" w:uiPriority="66" w:unhideWhenUsed="0"/>
+    <w:lsdException w:name="Medium Grid 1 Accent 3" w:semiHidden="0" w:uiPriority="67" w:unhideWhenUsed="0"/>
+    <w:lsdException w:name="Medium Grid 2 Accent 3" w:semiHidden="0" w:uiPriority="68" w:unhideWhenUsed="0"/>
+    <w:lsdException w:name="Medium Grid 3 Accent 3" w:semiHidden="0" w:uiPriority="69" w:unhideWhenUsed="0"/>
+    <w:lsdException w:name="Dark List Accent 3" w:semiHidden="0" w:uiPriority="70" w:unhideWhenUsed="0"/>
+    <w:lsdException w:name="Colorful Shading Accent 3" w:semiHidden="0" w:uiPriority="71" w:unhideWhenUsed="0"/>
+    <w:lsdException w:name="Colorful List Accent 3" w:semiHidden="0" w:uiPriority="72" w:unhideWhenUsed="0"/>
+    <w:lsdException w:name="Colorful Grid Accent 3" w:semiHidden="0" w:uiPriority="73" w:unhideWhenUsed="0"/>
+    <w:lsdException w:name="Light Shading Accent 4" w:semiHidden="0" w:uiPriority="60" w:unhideWhenUsed="0"/>
+    <w:lsdException w:name="Light List Accent 4" w:semiHidden="0" w:uiPriority="61" w:unhideWhenUsed="0"/>
+    <w:lsdException w:name="Light Grid Accent 4" w:semiHidden="0" w:uiPriority="62" w:unhideWhenUsed="0"/>
+    <w:lsdException w:name="Medium Shading 1 Accent 4" w:semiHidden="0" w:uiPriority="63" w:unhideWhenUsed="0"/>
+    <w:lsdException w:name="Medium Shading 2 Accent 4" w:semiHidden="0" w:uiPriority="64" w:unhideWhenUsed="0"/>
+    <w:lsdException w:name="Medium List 1 Accent 4" w:semiHidden="0" w:uiPriority="65" w:unhideWhenUsed="0"/>
+    <w:lsdException w:name="Medium List 2 Accent 4" w:semiHidden="0" w:uiPriority="66" w:unhideWhenUsed="0"/>
+    <w:lsdException w:name="Medium Grid 1 Accent 4" w:semiHidden="0" w:uiPriority="67" w:unhideWhenUsed="0"/>
+    <w:lsdException w:name="Medium Grid 2 Accent 4" w:semiHidden="0" w:uiPriority="68" w:unhideWhenUsed="0"/>
+    <w:lsdException w:name="Medium Grid 3 Accent 4" w:semiHidden="0" w:uiPriority="69" w:unhideWhenUsed="0"/>
+    <w:lsdException w:name="Dark List Accent 4" w:semiHidden="0" w:uiPriority="70" w:unhideWhenUsed="0"/>
+    <w:lsdException w:name="Colorful Shading Accent 4" w:semiHidden="0" w:uiPriority="71" w:unhideWhenUsed="0"/>
+    <w:lsdException w:name="Colorful List Accent 4" w:semiHidden="0" w:uiPriority="72" w:unhideWhenUsed="0"/>
+    <w:lsdException w:name="Colorful Grid Accent 4" w:semiHidden="0" w:uiPriority="73" w:unhideWhenUsed="0"/>
+    <w:lsdException w:name="Light Shading Accent 5" w:semiHidden="0" w:uiPriority="60" w:unhideWhenUsed="0"/>
+    <w:lsdException w:name="Light List Accent 5" w:semiHidden="0" w:uiPriority="61" w:unhideWhenUsed="0"/>
+    <w:lsdException w:name="Light Grid Accent 5" w:semiHidden="0" w:uiPriority="62" w:unhideWhenUsed="0"/>
+    <w:lsdException w:name="Medium Shading 1 Accent 5" w:semiHidden="0" w:uiPriority="63" w:unhideWhenUsed="0"/>
+    <w:lsdException w:name="Medium Shading 2 Accent 5" w:semiHidden="0" w:uiPriority="64" w:unhideWhenUsed="0"/>
+    <w:lsdException w:name="Medium List 1 Accent 5" w:semiHidden="0" w:uiPriority="65" w:unhideWhenUsed="0"/>
+    <w:lsdException w:name="Medium List 2 Accent 5" w:semiHidden="0" w:uiPriority="66" w:unhideWhenUsed="0"/>
+    <w:lsdException w:name="Medium Grid 1 Accent 5" w:semiHidden="0" w:uiPriority="67" w:unhideWhenUsed="0"/>
+    <w:lsdException w:name="Medium Grid 2 Accent 5" w:semiHidden="0" w:uiPriority="68" w:unhideWhenUsed="0"/>
+    <w:lsdException w:name="Medium Grid 3 Accent 5" w:semiHidden="0" w:uiPriority="69" w:unhideWhenUsed="0"/>
+    <w:lsdException w:name="Dark List Accent 5" w:semiHidden="0" w:uiPriority="70" w:unhideWhenUsed="0"/>
+    <w:lsdException w:name="Colorful Shading Accent 5" w:semiHidden="0" w:uiPriority="71" w:unhideWhenUsed="0"/>
+    <w:lsdException w:name="Colorful List Accent 5" w:semiHidden="0" w:uiPriority="72" w:unhideWhenUsed="0"/>
+    <w:lsdException w:name="Colorful Grid Accent 5" w:semiHidden="0" w:uiPriority="73" w:unhideWhenUsed="0"/>
+    <w:lsdException w:name="Light Shading Accent 6" w:semiHidden="0" w:uiPriority="60" w:unhideWhenUsed="0"/>
+    <w:lsdException w:name="Light List Accent 6" w:semiHidden="0" w:uiPriority="61" w:unhideWhenUsed="0"/>
+    <w:lsdException w:name="Light Grid Accent 6" w:semiHidden="0" w:uiPriority="62" w:unhideWhenUsed="0"/>
+    <w:lsdException w:name="Medium Shading 1 Accent 6" w:semiHidden="0" w:uiPriority="63" w:unhideWhenUsed="0"/>
+    <w:lsdException w:name="Medium Shading 2 Accent 6" w:semiHidden="0" w:uiPriority="64" w:unhideWhenUsed="0"/>
+    <w:lsdException w:name="Medium List 1 Accent 6" w:semiHidden="0" w:uiPriority="65" w:unhideWhenUsed="0"/>
+    <w:lsdException w:name="Medium List 2 Accent 6" w:semiHidden="0" w:uiPriority="66" w:unhideWhenUsed="0"/>
+    <w:lsdException w:name="Medium Grid 1 Accent 6" w:semiHidden="0" w:uiPriority="67" w:unhideWhenUsed="0"/>
+    <w:lsdException w:name="Medium Grid 2 Accent 6" w:semiHidden="0" w:uiPriority="68" w:unhideWhenUsed="0"/>
+    <w:lsdException w:name="Medium Grid 3 Accent 6" w:semiHidden="0" w:uiPriority="69" w:unhideWhenUsed="0"/>
+    <w:lsdException w:name="Dark List Accent 6" w:semiHidden="0" w:uiPriority="70" w:unhideWhenUsed="0"/>
+    <w:lsdException w:name="Colorful Shading Accent 6" w:semiHidden="0" w:uiPriority="71" w:unhideWhenUsed="0"/>
+    <w:lsdException w:name="Colorful List Accent 6" w:semiHidden="0" w:uiPriority="72" w:unhideWhenUsed="0"/>
+    <w:lsdException w:name="Colorful Grid Accent 6" w:semiHidden="0" w:uiPriority="73" w:unhideWhenUsed="0"/>
+    <w:lsdException w:name="Subtle Emphasis" w:semiHidden="0" w:uiPriority="19" w:unhideWhenUsed="0" w:qFormat="1"/>
+    <w:lsdException w:name="Intense Emphasis" w:semiHidden="0" w:uiPriority="21" w:unhideWhenUsed="0" w:qFormat="1"/>
+    <w:lsdException w:name="Subtle Reference" w:semiHidden="0" w:uiPriority="31" w:unhideWhenUsed="0" w:qFormat="1"/>
+    <w:lsdException w:name="Intense Reference" w:semiHidden="0" w:uiPriority="32" w:unhideWhenUsed="0" w:qFormat="1"/>
+    <w:lsdException w:name="Book Title" w:semiHidden="0" w:uiPriority="33" w:unhideWhenUsed="0" w:qFormat="1"/>
+    <w:lsdException w:name="Bibliography" w:uiPriority="37"/>
+    <w:lsdException w:name="TOC Heading" w:uiPriority="39" w:qFormat="1"/>
+  </w:latentStyles>
+  <w:style w:type="paragraph" w:default="1" w:styleId="a">
+    <w:name w:val="Normal"/>
+  </w:style>
+  <w:style w:type="paragraph" w:styleId="1">
+    <w:name w:val="heading 1"/>
+    <w:basedOn w:val="a"/>
+    <w:next w:val="a"/>
+    <w:pPr>
+      <w:keepNext/>
+      <w:keepLines/>
+      <w:spacing w:before="400" w:after="120"/>
+      <w:outlineLvl w:val="0"/>
+    </w:pPr>
+    <w:rPr>
+      <w:sz w:val="40"/>
+      <w:szCs w:val="40"/>
+    </w:rPr>
+  </w:style>
+  <w:style w:type="paragraph" w:styleId="2">
+    <w:name w:val="heading 2"/>
+    <w:basedOn w:val="a"/>
+    <w:next w:val="a"/>
+    <w:pPr>
+      <w:keepNext/>
+      <w:keepLines/>
+      <w:spacing w:before="360" w:after="120"/>
+      <w:outlineLvl w:val="1"/>
+    </w:pPr>
+    <w:rPr>
+      <w:sz w:val="32"/>
+      <w:szCs w:val="32"/>
+    </w:rPr>
+  </w:style>
+  <w:style w:type="paragraph" w:styleId="3">
+    <w:name w:val="heading 3"/>
+    <w:basedOn w:val="a"/>
+    <w:next w:val="a"/>
+    <w:pPr>
+      <w:keepNext/>
+      <w:keepLines/>
+      <w:spacing w:before="320" w:after="80"/>
+      <w:outlineLvl w:val="2"/>
+    </w:pPr>
+    <w:rPr>
+      <w:color w:val="434343"/>
+      <w:sz w:val="28"/>
+      <w:szCs w:val="28"/>
+    </w:rPr>
+  </w:style>
+  <w:style w:type="paragraph" w:styleId="4">
+    <w:name w:val="heading 4"/>
+    <w:basedOn w:val="a"/>
+    <w:next w:val="a"/>
+    <w:pPr>
+      <w:keepNext/>
+      <w:keepLines/>
+      <w:spacing w:before="280" w:after="80"/>
+      <w:outlineLvl w:val="3"/>
+    </w:pPr>
+    <w:rPr>
+      <w:color w:val="666666"/>
+      <w:sz w:val="24"/>
+      <w:szCs w:val="24"/>
+    </w:rPr>
+  </w:style>
+  <w:style w:type="paragraph" w:styleId="5">
+    <w:name w:val="heading 5"/>
+    <w:basedOn w:val="a"/>
+    <w:next w:val="a"/>
+    <w:pPr>
+      <w:keepNext/>
+      <w:keepLines/>
+      <w:spacing w:before="240" w:after="80"/>
+      <w:outlineLvl w:val="4"/>
+    </w:pPr>
+    <w:rPr>
+      <w:color w:val="666666"/>
+    </w:rPr>
+  </w:style>
+  <w:style w:type="paragraph" w:styleId="6">
+    <w:name w:val="heading 6"/>
+    <w:basedOn w:val="a"/>
+    <w:next w:val="a"/>
+    <w:pPr>
+      <w:keepNext/>
+      <w:keepLines/>
+      <w:spacing w:before="240" w:after="80"/>
+      <w:outlineLvl w:val="5"/>
+    </w:pPr>
+    <w:rPr>
+      <w:i/>
+      <w:color w:val="666666"/>
+    </w:rPr>
+  </w:style>
+  <w:style w:type="character" w:default="1" w:styleId="a0">
+    <w:name w:val="Default Paragraph Font"/>
+    <w:uiPriority w:val="1"/>
+    <w:semiHidden/>
+    <w:unhideWhenUsed/>
+  </w:style>
+  <w:style w:type="table" w:default="1" w:styleId="a1">
+    <w:name w:val="Normal Table"/>
+    <w:uiPriority w:val="99"/>
+    <w:semiHidden/>
+    <w:unhideWhenUsed/>
+    <w:tblPr>
+      <w:tblInd w:w="0" w:type="dxa"/>
+      <w:tblCellMar>
+        <w:top w:w="0" w:type="dxa"/>
+        <w:left w:w="108" w:type="dxa"/>
+        <w:bottom w:w="0" w:type="dxa"/>
+        <w:right w:w="108" w:type="dxa"/>
+      </w:tblCellMar>
+    </w:tblPr>
+  </w:style>
+  <w:style w:type="numbering" w:default="1" w:styleId="a2">
+    <w:name w:val="No List"/>
+    <w:uiPriority w:val="99"/>
+    <w:semiHidden/>
+    <w:unhideWhenUsed/>
+  </w:style>
+  <w:style w:type="table" w:customStyle="1" w:styleId="TableNormal">
+    <w:name w:val="Table Normal"/>
+    <w:tblPr>
+      <w:tblCellMar>
+        <w:top w:w="0" w:type="dxa"/>
+        <w:left w:w="0" w:type="dxa"/>
+        <w:bottom w:w="0" w:type="dxa"/>
+        <w:right w:w="0" w:type="dxa"/>
+      </w:tblCellMar>
+    </w:tblPr>
+  </w:style>
+  <w:style w:type="paragraph" w:styleId="a3">
+    <w:name w:val="Title"/>
+    <w:basedOn w:val="a"/>
+    <w:next w:val="a"/>
+    <w:pPr>
+      <w:keepNext/>
+      <w:keepLines/>
+      <w:spacing w:after="60"/>
+    </w:pPr>
+    <w:rPr>
+      <w:sz w:val="52"/>
+      <w:szCs w:val="52"/>
+    </w:rPr>
+  </w:style>
+  <w:style w:type="paragraph" w:styleId="a4">
+    <w:name w:val="Subtitle"/>
+    <w:basedOn w:val="a"/>
+    <w:next w:val="a"/>
+    <w:pPr>
+      <w:keepNext/>
+      <w:keepLines/>
+      <w:spacing w:after="320"/>
+    </w:pPr>
+    <w:rPr>
+      <w:color w:val="666666"/>
+      <w:sz w:val="30"/>
+      <w:szCs w:val="30"/>
+    </w:rPr>
+  </w:style>
+  <w:style w:type="paragraph" w:styleId="a5">
+    <w:name w:val="List Paragraph"/>
+    <w:basedOn w:val="a"/>
+    <w:uiPriority w:val="34"/>
+    <w:qFormat/>
+    <w:rsid w:val="00887F86"/>
+    <w:pPr>
+      <w:ind w:left="720"/>
+      <w:contextualSpacing/>
+    </w:pPr>
+  </w:style>
+  <w:style w:type="paragraph" w:styleId="a6">
+    <w:name w:val="Balloon Text"/>
+    <w:basedOn w:val="a"/>
+    <w:link w:val="a7"/>
+    <w:uiPriority w:val="99"/>
+    <w:semiHidden/>
+    <w:unhideWhenUsed/>
+    <w:rsid w:val="007C1162"/>
+    <w:pPr>
+      <w:spacing w:line="240" w:lineRule="auto"/>
+    </w:pPr>
+    <w:rPr>
+      <w:rFonts w:ascii="Tahoma" w:hAnsi="Tahoma" w:cs="Tahoma"/>
+      <w:sz w:val="16"/>
+      <w:szCs w:val="16"/>
+    </w:rPr>
+  </w:style>
+  <w:style w:type="character" w:customStyle="1" w:styleId="a7">
+    <w:name w:val="Текст выноски Знак"/>
+    <w:basedOn w:val="a0"/>
+    <w:link w:val="a6"/>
+    <w:uiPriority w:val="99"/>
+    <w:semiHidden/>
+    <w:rsid w:val="007C1162"/>
+    <w:rPr>
+      <w:rFonts w:ascii="Tahoma" w:hAnsi="Tahoma" w:cs="Tahoma"/>
+      <w:sz w:val="16"/>
+      <w:szCs w:val="16"/>
+    </w:rPr>
+  </w:style>
+</w:styles>
+</file>
+
+<file path=word/stylesWithEffects.xml><?xml version="1.0" encoding="utf-8"?>
+<w:styles xmlns:wpc="http://schemas.microsoft.com/office/word/2010/wordprocessingCanvas" xmlns:mc="http://schemas.openxmlformats.org/markup-compatibility/2006" xmlns:o="urn:schemas-microsoft-com:office:office" xmlns:r="http://schemas.openxmlformats.org/officeDocument/2006/relationships" xmlns:m="http://schemas.openxmlformats.org/officeDocument/2006/math" xmlns:v="urn:schemas-microsoft-com:vml" xmlns:wp14="http://schemas.microsoft.com/office/word/2010/wordprocessingDrawing" xmlns:wp="http://schemas.openxmlformats.org/drawingml/2006/wordprocessingDrawing" xmlns:w10="urn:schemas-microsoft-com:office:word" xmlns:w="http://schemas.openxmlformats.org/wordprocessingml/2006/main" xmlns:w14="http://schemas.microsoft.com/office/word/2010/wordml" xmlns:wpg="http://schemas.microsoft.com/office/word/2010/wordprocessingGroup" xmlns:wpi="http://schemas.microsoft.com/office/word/2010/wordprocessingInk" xmlns:wne="http://schemas.microsoft.com/office/word/2006/wordml" xmlns:wps="http://schemas.microsoft.com/office/word/2010/wordprocessingShape" mc:Ignorable="w14 wp14">
+  <w:docDefaults>
+    <w:rPrDefault>
+      <w:rPr>
+        <w:rFonts w:ascii="Arial" w:eastAsia="Arial" w:hAnsi="Arial" w:cs="Arial"/>
+        <w:sz w:val="22"/>
+        <w:szCs w:val="22"/>
+        <w:lang w:val="ru" w:eastAsia="ru-RU" w:bidi="ar-SA"/>
+      </w:rPr>
+    </w:rPrDefault>
+    <w:pPrDefault>
+      <w:pPr>
+        <w:spacing w:line="276" w:lineRule="auto"/>
+      </w:pPr>
+    </w:pPrDefault>
+  </w:docDefaults>
+  <w:latentStyles w:defLockedState="0" w:defUIPriority="99" w:defSemiHidden="1" w:defUnhideWhenUsed="1" w:defQFormat="0" w:count="267">
+    <w:lsdException w:name="Normal" w:semiHidden="0" w:uiPriority="0" w:unhideWhenUsed="0" w:qFormat="1"/>
+    <w:lsdException w:name="heading 1" w:semiHidden="0" w:uiPriority="9" w:unhideWhenUsed="0" w:qFormat="1"/>
+    <w:lsdException w:name="heading 2" w:uiPriority="9" w:qFormat="1"/>
+    <w:lsdException w:name="heading 3" w:uiPriority="9" w:qFormat="1"/>
+    <w:lsdException w:name="heading 4" w:uiPriority="9" w:qFormat="1"/>
+    <w:lsdException w:name="heading 5" w:uiPriority="9" w:qFormat="1"/>
+    <w:lsdException w:name="heading 6" w:uiPriority="9" w:qFormat="1"/>
+    <w:lsdException w:name="heading 7" w:uiPriority="9" w:qFormat="1"/>
+    <w:lsdException w:name="heading 8" w:uiPriority="9" w:qFormat="1"/>
+    <w:lsdException w:name="heading 9" w:uiPriority="9" w:qFormat="1"/>
+    <w:lsdException w:name="toc 1" w:uiPriority="39"/>
+    <w:lsdException w:name="toc 2" w:uiPriority="39"/>
+    <w:lsdException w:name="toc 3" w:uiPriority="39"/>
+    <w:lsdException w:name="toc 4" w:uiPriority="39"/>
+    <w:lsdException w:name="toc 5" w:uiPriority="39"/>
+    <w:lsdException w:name="toc 6" w:uiPriority="39"/>
+    <w:lsdException w:name="toc 7" w:uiPriority="39"/>
+    <w:lsdException w:name="toc 8" w:uiPriority="39"/>
+    <w:lsdException w:name="toc 9" w:uiPriority="39"/>
+    <w:lsdException w:name="caption" w:uiPriority="35" w:qFormat="1"/>
+    <w:lsdException w:name="Title" w:semiHidden="0" w:uiPriority="10" w:unhideWhenUsed="0" w:qFormat="1"/>
+    <w:lsdException w:name="Default Paragraph Font" w:uiPriority="1"/>
+    <w:lsdException w:name="Subtitle" w:semiHidden="0" w:uiPriority="11" w:unhideWhenUsed="0" w:qFormat="1"/>
+    <w:lsdException w:name="Strong" w:semiHidden="0" w:uiPriority="22" w:unhideWhenUsed="0" w:qFormat="1"/>
+    <w:lsdException w:name="Emphasis" w:semiHidden="0" w:uiPriority="20" w:unhideWhenUsed="0" w:qFormat="1"/>
+    <w:lsdException w:name="Table Grid" w:semiHidden="0" w:uiPriority="59" w:unhideWhenUsed="0"/>
+    <w:lsdException w:name="Placeholder Text" w:unhideWhenUsed="0"/>
+    <w:lsdException w:name="No Spacing" w:semiHidden="0" w:uiPriority="1" w:unhideWhenUsed="0" w:qFormat="1"/>
+    <w:lsdException w:name="Light Shading" w:semiHidden="0" w:uiPriority="60" w:unhideWhenUsed="0"/>
+    <w:lsdException w:name="Light List" w:semiHidden="0" w:uiPriority="61" w:unhideWhenUsed="0"/>
+    <w:lsdException w:name="Light Grid" w:semiHidden="0" w:uiPriority="62" w:unhideWhenUsed="0"/>
+    <w:lsdException w:name="Medium Shading 1" w:semiHidden="0" w:uiPriority="63" w:unhideWhenUsed="0"/>
+    <w:lsdException w:name="Medium Shading 2" w:semiHidden="0" w:uiPriority="64" w:unhideWhenUsed="0"/>
+    <w:lsdException w:name="Medium List 1" w:semiHidden="0" w:uiPriority="65" w:unhideWhenUsed="0"/>
+    <w:lsdException w:name="Medium List 2" w:semiHidden="0" w:uiPriority="66" w:unhideWhenUsed="0"/>
+    <w:lsdException w:name="Medium Grid 1" w:semiHidden="0" w:uiPriority="67" w:unhideWhenUsed="0"/>
+    <w:lsdException w:name="Medium Grid 2" w:semiHidden="0" w:uiPriority="68" w:unhideWhenUsed="0"/>
+    <w:lsdException w:name="Medium Grid 3" w:semiHidden="0" w:uiPriority="69" w:unhideWhenUsed="0"/>
+    <w:lsdException w:name="Dark List" w:semiHidden="0" w:uiPriority="70" w:unhideWhenUsed="0"/>
+    <w:lsdException w:name="Colorful Shading" w:semiHidden="0" w:uiPriority="71" w:unhideWhenUsed="0"/>
+    <w:lsdException w:name="Colorful List" w:semiHidden="0" w:uiPriority="72" w:unhideWhenUsed="0"/>
+    <w:lsdException w:name="Colorful Grid" w:semiHidden="0" w:uiPriority="73" w:unhideWhenUsed="0"/>
+    <w:lsdException w:name="Light Shading Accent 1" w:semiHidden="0" w:uiPriority="60" w:unhideWhenUsed="0"/>
+    <w:lsdException w:name="Light List Accent 1" w:semiHidden="0" w:uiPriority="61" w:unhideWhenUsed="0"/>
+    <w:lsdException w:name="Light Grid Accent 1" w:semiHidden="0" w:uiPriority="62" w:unhideWhenUsed="0"/>
+    <w:lsdException w:name="Medium Shading 1 Accent 1" w:semiHidden="0" w:uiPriority="63" w:unhideWhenUsed="0"/>
+    <w:lsdException w:name="Medium Shading 2 Accent 1" w:semiHidden="0" w:uiPriority="64" w:unhideWhenUsed="0"/>
+    <w:lsdException w:name="Medium List 1 Accent 1" w:semiHidden="0" w:uiPriority="65" w:unhideWhenUsed="0"/>
+    <w:lsdException w:name="Revision" w:unhideWhenUsed="0"/>
+    <w:lsdException w:name="List Paragraph" w:semiHidden="0" w:uiPriority="34" w:unhideWhenUsed="0" w:qFormat="1"/>
+    <w:lsdException w:name="Quote" w:semiHidden="0" w:uiPriority="29" w:unhideWhenUsed="0" w:qFormat="1"/>
+    <w:lsdException w:name="Intense Quote" w:semiHidden="0" w:uiPriority="30" w:unhideWhenUsed="0" w:qFormat="1"/>
+    <w:lsdException w:name="Medium List 2 Accent 1" w:semiHidden="0" w:uiPriority="66" w:unhideWhenUsed="0"/>
+    <w:lsdException w:name="Medium Grid 1 Accent 1" w:semiHidden="0" w:uiPriority="67" w:unhideWhenUsed="0"/>
+    <w:lsdException w:name="Medium Grid 2 Accent 1" w:semiHidden="0" w:uiPriority="68" w:unhideWhenUsed="0"/>
+    <w:lsdException w:name="Medium Grid 3 Accent 1" w:semiHidden="0" w:uiPriority="69" w:unhideWhenUsed="0"/>
+    <w:lsdException w:name="Dark List Accent 1" w:semiHidden="0" w:uiPriority="70" w:unhideWhenUsed="0"/>
+    <w:lsdException w:name="Colorful Shading Accent 1" w:semiHidden="0" w:uiPriority="71" w:unhideWhenUsed="0"/>
+    <w:lsdException w:name="Colorful List Accent 1" w:semiHidden="0" w:uiPriority="72" w:unhideWhenUsed="0"/>
+    <w:lsdException w:name="Colorful Grid Accent 1" w:semiHidden="0" w:uiPriority="73" w:unhideWhenUsed="0"/>
+    <w:lsdException w:name="Light Shading Accent 2" w:semiHidden="0" w:uiPriority="60" w:unhideWhenUsed="0"/>
+    <w:lsdException w:name="Light List Accent 2" w:semiHidden="0" w:uiPriority="61" w:unhideWhenUsed="0"/>
+    <w:lsdException w:name="Light Grid Accent 2" w:semiHidden="0" w:uiPriority="62" w:unhideWhenUsed="0"/>
+    <w:lsdException w:name="Medium Shading 1 Accent 2" w:semiHidden="0" w:uiPriority="63" w:unhideWhenUsed="0"/>
+    <w:lsdException w:name="Medium Shading 2 Accent 2" w:semiHidden="0" w:uiPriority="64" w:unhideWhenUsed="0"/>
+    <w:lsdException w:name="Medium List 1 Accent 2" w:semiHidden="0" w:uiPriority="65" w:unhideWhenUsed="0"/>
+    <w:lsdException w:name="Medium List 2 Accent 2" w:semiHidden="0" w:uiPriority="66" w:unhideWhenUsed="0"/>
+    <w:lsdException w:name="Medium Grid 1 Accent 2" w:semiHidden="0" w:uiPriority="67" w:unhideWhenUsed="0"/>
+    <w:lsdException w:name="Medium Grid 2 Accent 2" w:semiHidden="0" w:uiPriority="68" w:unhideWhenUsed="0"/>
+    <w:lsdException w:name="Medium Grid 3 Accent 2" w:semiHidden="0" w:uiPriority="69" w:unhideWhenUsed="0"/>
+    <w:lsdException w:name="Dark List Accent 2" w:semiHidden="0" w:uiPriority="70" w:unhideWhenUsed="0"/>
+    <w:lsdException w:name="Colorful Shading Accent 2" w:semiHidden="0" w:uiPriority="71" w:unhideWhenUsed="0"/>
+    <w:lsdException w:name="Colorful List Accent 2" w:semiHidden="0" w:uiPriority="72" w:unhideWhenUsed="0"/>
+    <w:lsdException w:name="Colorful Grid Accent 2" w:semiHidden="0" w:uiPriority="73" w:unhideWhenUsed="0"/>
+    <w:lsdException w:name="Light Shading Accent 3" w:semiHidden="0" w:uiPriority="60" w:unhideWhenUsed="0"/>
+    <w:lsdException w:name="Light List Accent 3" w:semiHidden="0" w:uiPriority="61" w:unhideWhenUsed="0"/>
+    <w:lsdException w:name="Light Grid Accent 3" w:semiHidden="0" w:uiPriority="62" w:unhideWhenUsed="0"/>
+    <w:lsdException w:name="Medium Shading 1 Accent 3" w:semiHidden="0" w:uiPriority="63" w:unhideWhenUsed="0"/>
+    <w:lsdException w:name="Medium Shading 2 Accent 3" w:semiHidden="0" w:uiPriority="64" w:unhideWhenUsed="0"/>
+    <w:lsdException w:name="Medium List 1 Accent 3" w:semiHidden="0" w:uiPriority="65" w:unhideWhenUsed="0"/>
+    <w:lsdException w:name="Medium List 2 Accent 3" w:semiHidden="0" w:uiPriority="66" w:unhideWhenUsed="0"/>
+    <w:lsdException w:name="Medium Grid 1 Accent 3" w:semiHidden="0" w:uiPriority="67" w:unhideWhenUsed="0"/>
+    <w:lsdException w:name="Medium Grid 2 Accent 3" w:semiHidden="0" w:uiPriority="68" w:unhideWhenUsed="0"/>
+    <w:lsdException w:name="Medium Grid 3 Accent 3" w:semiHidden="0" w:uiPriority="69" w:unhideWhenUsed="0"/>
+    <w:lsdException w:name="Dark List Accent 3" w:semiHidden="0" w:uiPriority="70" w:unhideWhenUsed="0"/>
+    <w:lsdException w:name="Colorful Shading Accent 3" w:semiHidden="0" w:uiPriority="71" w:unhideWhenUsed="0"/>
+    <w:lsdException w:name="Colorful List Accent 3" w:semiHidden="0" w:uiPriority="72" w:unhideWhenUsed="0"/>
+    <w:lsdException w:name="Colorful Grid Accent 3" w:semiHidden="0" w:uiPriority="73" w:unhideWhenUsed="0"/>
+    <w:lsdException w:name="Light Shading Accent 4" w:semiHidden="0" w:uiPriority="60" w:unhideWhenUsed="0"/>
+    <w:lsdException w:name="Light List Accent 4" w:semiHidden="0" w:uiPriority="61" w:unhideWhenUsed="0"/>
+    <w:lsdException w:name="Light Grid Accent 4" w:semiHidden="0" w:uiPriority="62" w:unhideWhenUsed="0"/>
+    <w:lsdException w:name="Medium Shading 1 Accent 4" w:semiHidden="0" w:uiPriority="63" w:unhideWhenUsed="0"/>
+    <w:lsdException w:name="Medium Shading 2 Accent 4" w:semiHidden="0" w:uiPriority="64" w:unhideWhenUsed="0"/>
+    <w:lsdException w:name="Medium List 1 Accent 4" w:semiHidden="0" w:uiPriority="65" w:unhideWhenUsed="0"/>
+    <w:lsdException w:name="Medium List 2 Accent 4" w:semiHidden="0" w:uiPriority="66" w:unhideWhenUsed="0"/>
+    <w:lsdException w:name="Medium Grid 1 Accent 4" w:semiHidden="0" w:uiPriority="67" w:unhideWhenUsed="0"/>
+    <w:lsdException w:name="Medium Grid 2 Accent 4" w:semiHidden="0" w:uiPriority="68" w:unhideWhenUsed="0"/>
+    <w:lsdException w:name="Medium Grid 3 Accent 4" w:semiHidden="0" w:uiPriority="69" w:unhideWhenUsed="0"/>
+    <w:lsdException w:name="Dark List Accent 4" w:semiHidden="0" w:uiPriority="70" w:unhideWhenUsed="0"/>
+    <w:lsdException w:name="Colorful Shading Accent 4" w:semiHidden="0" w:uiPriority="71" w:unhideWhenUsed="0"/>
+    <w:lsdException w:name="Colorful List Accent 4" w:semiHidden="0" w:uiPriority="72" w:unhideWhenUsed="0"/>
+    <w:lsdException w:name="Colorful Grid Accent 4" w:semiHidden="0" w:uiPriority="73" w:unhideWhenUsed="0"/>
+    <w:lsdException w:name="Light Shading Accent 5" w:semiHidden="0" w:uiPriority="60" w:unhideWhenUsed="0"/>
+    <w:lsdException w:name="Light List Accent 5" w:semiHidden="0" w:uiPriority="61" w:unhideWhenUsed="0"/>
+    <w:lsdException w:name="Light Grid Accent 5" w:semiHidden="0" w:uiPriority="62" w:unhideWhenUsed="0"/>
+    <w:lsdException w:name="Medium Shading 1 Accent 5" w:semiHidden="0" w:uiPriority="63" w:unhideWhenUsed="0"/>
+    <w:lsdException w:name="Medium Shading 2 Accent 5" w:semiHidden="0" w:uiPriority="64" w:unhideWhenUsed="0"/>
+    <w:lsdException w:name="Medium List 1 Accent 5" w:semiHidden="0" w:uiPriority="65" w:unhideWhenUsed="0"/>
+    <w:lsdException w:name="Medium List 2 Accent 5" w:semiHidden="0" w:uiPriority="66" w:unhideWhenUsed="0"/>
+    <w:lsdException w:name="Medium Grid 1 Accent 5" w:semiHidden="0" w:uiPriority="67" w:unhideWhenUsed="0"/>
+    <w:lsdException w:name="Medium Grid 2 Accent 5" w:semiHidden="0" w:uiPriority="68" w:unhideWhenUsed="0"/>
+    <w:lsdException w:name="Medium Grid 3 Accent 5" w:semiHidden="0" w:uiPriority="69" w:unhideWhenUsed="0"/>
+    <w:lsdException w:name="Dark List Accent 5" w:semiHidden="0" w:uiPriority="70" w:unhideWhenUsed="0"/>
+    <w:lsdException w:name="Colorful Shading Accent 5" w:semiHidden="0" w:uiPriority="71" w:unhideWhenUsed="0"/>
+    <w:lsdException w:name="Colorful List Accent 5" w:semiHidden="0" w:uiPriority="72" w:unhideWhenUsed="0"/>
+    <w:lsdException w:name="Colorful Grid Accent 5" w:semiHidden="0" w:uiPriority="73" w:unhideWhenUsed="0"/>
+    <w:lsdException w:name="Light Shading Accent 6" w:semiHidden="0" w:uiPriority="60" w:unhideWhenUsed="0"/>
+    <w:lsdException w:name="Light List Accent 6" w:semiHidden="0" w:uiPriority="61" w:unhideWhenUsed="0"/>
+    <w:lsdException w:name="Light Grid Accent 6" w:semiHidden="0" w:uiPriority="62" w:unhideWhenUsed="0"/>
+    <w:lsdException w:name="Medium Shading 1 Accent 6" w:semiHidden="0" w:uiPriority="63" w:unhideWhenUsed="0"/>
+    <w:lsdException w:name="Medium Shading 2 Accent 6" w:semiHidden="0" w:uiPriority="64" w:unhideWhenUsed="0"/>
+    <w:lsdException w:name="Medium List 1 Accent 6" w:semiHidden="0" w:uiPriority="65" w:unhideWhenUsed="0"/>
+    <w:lsdException w:name="Medium List 2 Accent 6" w:semiHidden="0" w:uiPriority="66" w:unhideWhenUsed="0"/>
+    <w:lsdException w:name="Medium Grid 1 Accent 6" w:semiHidden="0" w:uiPriority="67" w:unhideWhenUsed="0"/>
+    <w:lsdException w:name="Medium Grid 2 Accent 6" w:semiHidden="0" w:uiPriority="68" w:unhideWhenUsed="0"/>
+    <w:lsdException w:name="Medium Grid 3 Accent 6" w:semiHidden="0" w:uiPriority="69" w:unhideWhenUsed="0"/>
+    <w:lsdException w:name="Dark List Accent 6" w:semiHidden="0" w:uiPriority="70" w:unhideWhenUsed="0"/>
+    <w:lsdException w:name="Colorful Shading Accent 6" w:semiHidden="0" w:uiPriority="71" w:unhideWhenUsed="0"/>
+    <w:lsdException w:name="Colorful List Accent 6" w:semiHidden="0" w:uiPriority="72" w:unhideWhenUsed="0"/>
+    <w:lsdException w:name="Colorful Grid Accent 6" w:semiHidden="0" w:uiPriority="73" w:unhideWhenUsed="0"/>
+    <w:lsdException w:name="Subtle Emphasis" w:semiHidden="0" w:uiPriority="19" w:unhideWhenUsed="0" w:qFormat="1"/>
+    <w:lsdException w:name="Intense Emphasis" w:semiHidden="0" w:uiPriority="21" w:unhideWhenUsed="0" w:qFormat="1"/>
+    <w:lsdException w:name="Subtle Reference" w:semiHidden="0" w:uiPriority="31" w:unhideWhenUsed="0" w:qFormat="1"/>
+    <w:lsdException w:name="Intense Reference" w:semiHidden="0" w:uiPriority="32" w:unhideWhenUsed="0" w:qFormat="1"/>
+    <w:lsdException w:name="Book Title" w:semiHidden="0" w:uiPriority="33" w:unhideWhenUsed="0" w:qFormat="1"/>
+    <w:lsdException w:name="Bibliography" w:uiPriority="37"/>
+    <w:lsdException w:name="TOC Heading" w:uiPriority="39" w:qFormat="1"/>
   </w:latentStyles>
   <w:style w:type="paragraph" w:default="1" w:styleId="a">
     <w:name w:val="Normal"/>

</xml_diff>